<commit_message>
credencials y codigo fuente
</commit_message>
<xml_diff>
--- a/documentacion/3. ARQUITECTURA DE SOFTWARE ORIS.docx
+++ b/documentacion/3. ARQUITECTURA DE SOFTWARE ORIS.docx
@@ -1776,60 +1776,16 @@
           <w:szCs w:val="21"/>
           <w:lang w:val="es-PE"/>
         </w:rPr>
-        <w:t>Microservicios (</w:t>
-      </w:r>
-      <w:proofErr w:type="spellStart"/>
-      <w:r>
-        <w:rPr>
-          <w:rFonts w:ascii="Arial" w:hAnsi="Arial" w:cs="Arial"/>
-          <w:b/>
-          <w:bCs/>
-          <w:sz w:val="21"/>
-          <w:szCs w:val="21"/>
-          <w:lang w:val="es-PE"/>
-        </w:rPr>
-        <w:t>Microservices</w:t>
-      </w:r>
-      <w:proofErr w:type="spellEnd"/>
-      <w:r>
-        <w:rPr>
-          <w:rFonts w:ascii="Arial" w:hAnsi="Arial" w:cs="Arial"/>
-          <w:b/>
-          <w:bCs/>
-          <w:sz w:val="21"/>
-          <w:szCs w:val="21"/>
-          <w:lang w:val="es-PE"/>
-        </w:rPr>
-        <w:t>):</w:t>
-      </w:r>
-      <w:r>
-        <w:rPr>
-          <w:rFonts w:ascii="Arial" w:hAnsi="Arial" w:cs="Arial"/>
-          <w:sz w:val="21"/>
-          <w:szCs w:val="21"/>
-          <w:lang w:val="es-PE"/>
-        </w:rPr>
-        <w:t xml:space="preserve"> Enfoque arquitectónico donde la aplicación se compone de servicios pequeños e independientes que se comunican a través de </w:t>
-      </w:r>
-      <w:proofErr w:type="spellStart"/>
-      <w:r>
-        <w:rPr>
-          <w:rFonts w:ascii="Arial" w:hAnsi="Arial" w:cs="Arial"/>
-          <w:sz w:val="21"/>
-          <w:szCs w:val="21"/>
-          <w:lang w:val="es-PE"/>
-        </w:rPr>
-        <w:t>APIs</w:t>
-      </w:r>
-      <w:proofErr w:type="spellEnd"/>
-      <w:r>
-        <w:rPr>
-          <w:rFonts w:ascii="Arial" w:hAnsi="Arial" w:cs="Arial"/>
-          <w:sz w:val="21"/>
-          <w:szCs w:val="21"/>
-          <w:lang w:val="es-PE"/>
-        </w:rPr>
-        <w:t xml:space="preserve"> bien definidas.</w:t>
+        <w:t>Microservicios (Microservices):</w:t>
+      </w:r>
+      <w:r>
+        <w:rPr>
+          <w:rFonts w:ascii="Arial" w:hAnsi="Arial" w:cs="Arial"/>
+          <w:sz w:val="21"/>
+          <w:szCs w:val="21"/>
+          <w:lang w:val="es-PE"/>
+        </w:rPr>
+        <w:t xml:space="preserve"> Enfoque arquitectónico donde la aplicación se compone de servicios pequeños e independientes que se comunican a través de APIs bien definidas.</w:t>
       </w:r>
     </w:p>
     <w:p>
@@ -1856,55 +1812,7 @@
           <w:szCs w:val="21"/>
           <w:lang w:val="es-PE"/>
         </w:rPr>
-        <w:t>SPA (</w:t>
-      </w:r>
-      <w:proofErr w:type="gramStart"/>
-      <w:r>
-        <w:rPr>
-          <w:rFonts w:ascii="Arial" w:hAnsi="Arial" w:cs="Arial"/>
-          <w:b/>
-          <w:bCs/>
-          <w:sz w:val="21"/>
-          <w:szCs w:val="21"/>
-          <w:lang w:val="es-PE"/>
-        </w:rPr>
-        <w:t>Single</w:t>
-      </w:r>
-      <w:proofErr w:type="gramEnd"/>
-      <w:r>
-        <w:rPr>
-          <w:rFonts w:ascii="Arial" w:hAnsi="Arial" w:cs="Arial"/>
-          <w:b/>
-          <w:bCs/>
-          <w:sz w:val="21"/>
-          <w:szCs w:val="21"/>
-          <w:lang w:val="es-PE"/>
-        </w:rPr>
-        <w:t xml:space="preserve"> Page </w:t>
-      </w:r>
-      <w:proofErr w:type="spellStart"/>
-      <w:r>
-        <w:rPr>
-          <w:rFonts w:ascii="Arial" w:hAnsi="Arial" w:cs="Arial"/>
-          <w:b/>
-          <w:bCs/>
-          <w:sz w:val="21"/>
-          <w:szCs w:val="21"/>
-          <w:lang w:val="es-PE"/>
-        </w:rPr>
-        <w:t>Application</w:t>
-      </w:r>
-      <w:proofErr w:type="spellEnd"/>
-      <w:r>
-        <w:rPr>
-          <w:rFonts w:ascii="Arial" w:hAnsi="Arial" w:cs="Arial"/>
-          <w:b/>
-          <w:bCs/>
-          <w:sz w:val="21"/>
-          <w:szCs w:val="21"/>
-          <w:lang w:val="es-PE"/>
-        </w:rPr>
-        <w:t>):</w:t>
+        <w:t>SPA (Single Page Application):</w:t>
       </w:r>
       <w:r>
         <w:rPr>
@@ -1940,55 +1848,7 @@
           <w:szCs w:val="21"/>
           <w:lang w:val="es-PE"/>
         </w:rPr>
-        <w:t xml:space="preserve">Seguridad desde el Diseño (Security </w:t>
-      </w:r>
-      <w:proofErr w:type="spellStart"/>
-      <w:r>
-        <w:rPr>
-          <w:rFonts w:ascii="Arial" w:hAnsi="Arial" w:cs="Arial"/>
-          <w:b/>
-          <w:bCs/>
-          <w:sz w:val="21"/>
-          <w:szCs w:val="21"/>
-          <w:lang w:val="es-PE"/>
-        </w:rPr>
-        <w:t>by</w:t>
-      </w:r>
-      <w:proofErr w:type="spellEnd"/>
-      <w:r>
-        <w:rPr>
-          <w:rFonts w:ascii="Arial" w:hAnsi="Arial" w:cs="Arial"/>
-          <w:b/>
-          <w:bCs/>
-          <w:sz w:val="21"/>
-          <w:szCs w:val="21"/>
-          <w:lang w:val="es-PE"/>
-        </w:rPr>
-        <w:t xml:space="preserve"> </w:t>
-      </w:r>
-      <w:proofErr w:type="spellStart"/>
-      <w:r>
-        <w:rPr>
-          <w:rFonts w:ascii="Arial" w:hAnsi="Arial" w:cs="Arial"/>
-          <w:b/>
-          <w:bCs/>
-          <w:sz w:val="21"/>
-          <w:szCs w:val="21"/>
-          <w:lang w:val="es-PE"/>
-        </w:rPr>
-        <w:t>Design</w:t>
-      </w:r>
-      <w:proofErr w:type="spellEnd"/>
-      <w:r>
-        <w:rPr>
-          <w:rFonts w:ascii="Arial" w:hAnsi="Arial" w:cs="Arial"/>
-          <w:b/>
-          <w:bCs/>
-          <w:sz w:val="21"/>
-          <w:szCs w:val="21"/>
-          <w:lang w:val="es-PE"/>
-        </w:rPr>
-        <w:t>):</w:t>
+        <w:t>Seguridad desde el Diseño (Security by Design):</w:t>
       </w:r>
       <w:r>
         <w:rPr>
@@ -2015,29 +1875,16 @@
           <w:lang w:val="es-PE"/>
         </w:rPr>
       </w:pPr>
-      <w:proofErr w:type="spellStart"/>
-      <w:r>
-        <w:rPr>
-          <w:rFonts w:ascii="Arial" w:hAnsi="Arial" w:cs="Arial"/>
-          <w:b/>
-          <w:bCs/>
-          <w:sz w:val="21"/>
-          <w:szCs w:val="21"/>
-          <w:lang w:val="es-PE"/>
-        </w:rPr>
-        <w:t>Hardening</w:t>
-      </w:r>
-      <w:proofErr w:type="spellEnd"/>
-      <w:r>
-        <w:rPr>
-          <w:rFonts w:ascii="Arial" w:hAnsi="Arial" w:cs="Arial"/>
-          <w:b/>
-          <w:bCs/>
-          <w:sz w:val="21"/>
-          <w:szCs w:val="21"/>
-          <w:lang w:val="es-PE"/>
-        </w:rPr>
-        <w:t>:</w:t>
+      <w:r>
+        <w:rPr>
+          <w:rFonts w:ascii="Arial" w:hAnsi="Arial" w:cs="Arial"/>
+          <w:b/>
+          <w:bCs/>
+          <w:sz w:val="21"/>
+          <w:szCs w:val="21"/>
+          <w:lang w:val="es-PE"/>
+        </w:rPr>
+        <w:t>Hardening:</w:t>
       </w:r>
       <w:r>
         <w:rPr>
@@ -2328,43 +2175,7 @@
           <w:sz w:val="21"/>
           <w:szCs w:val="21"/>
         </w:rPr>
-        <w:t xml:space="preserve"> </w:t>
-      </w:r>
-      <w:proofErr w:type="spellStart"/>
-      <w:r>
-        <w:rPr>
-          <w:rFonts w:ascii="Arial" w:hAnsi="Arial" w:cs="Arial"/>
-          <w:sz w:val="21"/>
-          <w:szCs w:val="21"/>
-        </w:rPr>
-        <w:t>Patrones</w:t>
-      </w:r>
-      <w:proofErr w:type="spellEnd"/>
-      <w:r>
-        <w:rPr>
-          <w:rFonts w:ascii="Arial" w:hAnsi="Arial" w:cs="Arial"/>
-          <w:sz w:val="21"/>
-          <w:szCs w:val="21"/>
-        </w:rPr>
-        <w:t xml:space="preserve"> Data Access Object </w:t>
-      </w:r>
-      <w:proofErr w:type="gramStart"/>
-      <w:r>
-        <w:rPr>
-          <w:rFonts w:ascii="Arial" w:hAnsi="Arial" w:cs="Arial"/>
-          <w:sz w:val="21"/>
-          <w:szCs w:val="21"/>
-        </w:rPr>
-        <w:t>y</w:t>
-      </w:r>
-      <w:proofErr w:type="gramEnd"/>
-      <w:r>
-        <w:rPr>
-          <w:rFonts w:ascii="Arial" w:hAnsi="Arial" w:cs="Arial"/>
-          <w:sz w:val="21"/>
-          <w:szCs w:val="21"/>
-        </w:rPr>
-        <w:t xml:space="preserve"> Data Transfer Object.</w:t>
+        <w:t xml:space="preserve"> Patrones Data Access Object y Data Transfer Object.</w:t>
       </w:r>
     </w:p>
     <w:p>
@@ -2397,25 +2208,7 @@
           <w:sz w:val="21"/>
           <w:szCs w:val="21"/>
         </w:rPr>
-        <w:t xml:space="preserve"> Object-Relational Mapping (</w:t>
-      </w:r>
-      <w:proofErr w:type="spellStart"/>
-      <w:r>
-        <w:rPr>
-          <w:rFonts w:ascii="Arial" w:hAnsi="Arial" w:cs="Arial"/>
-          <w:sz w:val="21"/>
-          <w:szCs w:val="21"/>
-        </w:rPr>
-        <w:t>ej</w:t>
-      </w:r>
-      <w:proofErr w:type="spellEnd"/>
-      <w:r>
-        <w:rPr>
-          <w:rFonts w:ascii="Arial" w:hAnsi="Arial" w:cs="Arial"/>
-          <w:sz w:val="21"/>
-          <w:szCs w:val="21"/>
-        </w:rPr>
-        <w:t>., JPA, Hibernate).</w:t>
+        <w:t xml:space="preserve"> Object-Relational Mapping (ej., JPA, Hibernate).</w:t>
       </w:r>
     </w:p>
     <w:p>
@@ -2556,47 +2349,7 @@
           <w:szCs w:val="21"/>
           <w:lang w:val="es-PE"/>
         </w:rPr>
-        <w:t xml:space="preserve">Este documento analiza la arquitectura presentando los módulos principales, casos de uso, </w:t>
-      </w:r>
-      <w:proofErr w:type="spellStart"/>
-      <w:r>
-        <w:rPr>
-          <w:rFonts w:ascii="Arial" w:hAnsi="Arial" w:cs="Arial"/>
-          <w:sz w:val="21"/>
-          <w:szCs w:val="21"/>
-          <w:lang w:val="es-PE"/>
-        </w:rPr>
-        <w:t>stack</w:t>
-      </w:r>
-      <w:proofErr w:type="spellEnd"/>
-      <w:r>
-        <w:rPr>
-          <w:rFonts w:ascii="Arial" w:hAnsi="Arial" w:cs="Arial"/>
-          <w:sz w:val="21"/>
-          <w:szCs w:val="21"/>
-          <w:lang w:val="es-PE"/>
-        </w:rPr>
-        <w:t xml:space="preserve"> tecnológico, y la conexión entre los distintos niveles (Front-End SPA, Back-End Microservicios, Contenedores Docker/</w:t>
-      </w:r>
-      <w:proofErr w:type="spellStart"/>
-      <w:r>
-        <w:rPr>
-          <w:rFonts w:ascii="Arial" w:hAnsi="Arial" w:cs="Arial"/>
-          <w:sz w:val="21"/>
-          <w:szCs w:val="21"/>
-          <w:lang w:val="es-PE"/>
-        </w:rPr>
-        <w:t>Kubernetes</w:t>
-      </w:r>
-      <w:proofErr w:type="spellEnd"/>
-      <w:r>
-        <w:rPr>
-          <w:rFonts w:ascii="Arial" w:hAnsi="Arial" w:cs="Arial"/>
-          <w:sz w:val="21"/>
-          <w:szCs w:val="21"/>
-          <w:lang w:val="es-PE"/>
-        </w:rPr>
-        <w:t>) empleando metodologías Ágiles incrementales.</w:t>
+        <w:t>Este documento analiza la arquitectura presentando los módulos principales, casos de uso, stack tecnológico, y la conexión entre los distintos niveles (Front-End SPA, Back-End Microservicios, Contenedores Docker/Kubernetes) empleando metodologías Ágiles incrementales.</w:t>
       </w:r>
     </w:p>
     <w:p>
@@ -2699,57 +2452,36 @@
           <w:szCs w:val="21"/>
           <w:lang w:val="es-PE"/>
         </w:rPr>
-        <w:t>La arquitectura será basada en servicios y microservicios, desacoplando funcionalidades para facilitar actualizaciones independientes y escalar componentes específicos según la demanda, apoyados en el uso de contenedores (Docker) y orquestación (</w:t>
-      </w:r>
-      <w:proofErr w:type="spellStart"/>
-      <w:r>
-        <w:rPr>
-          <w:rFonts w:ascii="Arial" w:hAnsi="Arial" w:cs="Arial"/>
-          <w:sz w:val="21"/>
-          <w:szCs w:val="21"/>
-          <w:lang w:val="es-PE"/>
-        </w:rPr>
-        <w:t>Kubernetes</w:t>
-      </w:r>
-      <w:proofErr w:type="spellEnd"/>
-      <w:r>
-        <w:rPr>
-          <w:rFonts w:ascii="Arial" w:hAnsi="Arial" w:cs="Arial"/>
-          <w:sz w:val="21"/>
-          <w:szCs w:val="21"/>
-          <w:lang w:val="es-PE"/>
-        </w:rPr>
-        <w:t>).</w:t>
+        <w:t>La arquitectura será basada en servicios y microservicios, desacoplando funcionalidades para facilitar actualizaciones independientes y escalar componentes específicos según la demanda, apoyados en el uso de contenedores (Docker) y orquestación (Kubernetes).</w:t>
       </w:r>
     </w:p>
     <w:p>
       <w:pPr>
         <w:pStyle w:val="Textodebloque"/>
-        <w:jc w:val="both"/>
-        <w:rPr>
-          <w:rFonts w:ascii="Arial" w:hAnsi="Arial" w:cs="Arial"/>
-          <w:b/>
-          <w:bCs/>
-          <w:sz w:val="21"/>
-          <w:szCs w:val="21"/>
-          <w:lang w:val="es-PE"/>
-        </w:rPr>
-      </w:pPr>
-      <w:r>
-        <w:rPr>
-          <w:rFonts w:ascii="Arial" w:hAnsi="Arial" w:cs="Arial"/>
-          <w:b/>
-          <w:bCs/>
-          <w:noProof/>
-          <w:sz w:val="21"/>
-          <w:szCs w:val="21"/>
-          <w:lang w:val="es-PE"/>
+        <w:jc w:val="center"/>
+        <w:rPr>
+          <w:rFonts w:ascii="Arial" w:hAnsi="Arial" w:cs="Arial"/>
+          <w:b/>
+          <w:bCs/>
+          <w:sz w:val="21"/>
+          <w:szCs w:val="21"/>
+          <w:lang w:val="es-ES"/>
+        </w:rPr>
+      </w:pPr>
+      <w:r>
+        <w:rPr>
+          <w:rFonts w:ascii="Arial" w:hAnsi="Arial" w:cs="Arial"/>
+          <w:b/>
+          <w:bCs/>
+          <w:sz w:val="21"/>
+          <w:szCs w:val="21"/>
+          <w:lang w:val="es-ES"/>
         </w:rPr>
         <w:drawing>
-          <wp:inline distT="0" distB="0" distL="0" distR="0" wp14:anchorId="163A18FC" wp14:editId="0536CCFA">
-            <wp:extent cx="6625988" cy="4329101"/>
-            <wp:effectExtent l="0" t="0" r="3810" b="0"/>
-            <wp:docPr id="1114577257" name="Imagen 1"/>
+          <wp:inline distT="0" distB="0" distL="0" distR="0" wp14:anchorId="1657E562" wp14:editId="12A30F1F">
+            <wp:extent cx="6043212" cy="4221125"/>
+            <wp:effectExtent l="0" t="0" r="0" b="8255"/>
+            <wp:docPr id="761535725" name="Imagen 6" descr="Diagrama&#10;&#10;El contenido generado por IA puede ser incorrecto."/>
             <wp:cNvGraphicFramePr>
               <a:graphicFrameLocks xmlns:a="http://schemas.openxmlformats.org/drawingml/2006/main" noChangeAspect="1"/>
             </wp:cNvGraphicFramePr>
@@ -2757,7 +2489,7 @@
               <a:graphicData uri="http://schemas.openxmlformats.org/drawingml/2006/picture">
                 <pic:pic xmlns:pic="http://schemas.openxmlformats.org/drawingml/2006/picture">
                   <pic:nvPicPr>
-                    <pic:cNvPr id="0" name="Picture 1"/>
+                    <pic:cNvPr id="761535725" name="Imagen 6" descr="Diagrama&#10;&#10;El contenido generado por IA puede ser incorrecto."/>
                     <pic:cNvPicPr>
                       <a:picLocks noChangeAspect="1" noChangeArrowheads="1"/>
                     </pic:cNvPicPr>
@@ -2778,7 +2510,7 @@
                   <pic:spPr bwMode="auto">
                     <a:xfrm>
                       <a:off x="0" y="0"/>
-                      <a:ext cx="6643090" cy="4340275"/>
+                      <a:ext cx="6068125" cy="4238527"/>
                     </a:xfrm>
                     <a:prstGeom prst="rect">
                       <a:avLst/>
@@ -2808,6 +2540,7 @@
           <w:lang w:val="es-PE"/>
         </w:rPr>
         <w:sectPr>
+          <w:headerReference w:type="default" r:id="rId11"/>
           <w:footnotePr>
             <w:numRestart w:val="eachSect"/>
           </w:footnotePr>
@@ -2924,33 +2657,7 @@
           <w:szCs w:val="21"/>
           <w:lang w:val="es-PE"/>
         </w:rPr>
-        <w:t>Presentación (</w:t>
-      </w:r>
-      <w:proofErr w:type="spellStart"/>
-      <w:r>
-        <w:rPr>
-          <w:rFonts w:ascii="Arial" w:hAnsi="Arial" w:cs="Arial"/>
-          <w:b/>
-          <w:bCs/>
-          <w:color w:val="auto"/>
-          <w:sz w:val="21"/>
-          <w:szCs w:val="21"/>
-          <w:lang w:val="es-PE"/>
-        </w:rPr>
-        <w:t>Frontend</w:t>
-      </w:r>
-      <w:proofErr w:type="spellEnd"/>
-      <w:r>
-        <w:rPr>
-          <w:rFonts w:ascii="Arial" w:hAnsi="Arial" w:cs="Arial"/>
-          <w:b/>
-          <w:bCs/>
-          <w:color w:val="auto"/>
-          <w:sz w:val="21"/>
-          <w:szCs w:val="21"/>
-          <w:lang w:val="es-PE"/>
-        </w:rPr>
-        <w:t xml:space="preserve"> / Cliente Web)</w:t>
+        <w:t>Presentación (Frontend / Cliente Web)</w:t>
       </w:r>
     </w:p>
     <w:p>
@@ -2994,7 +2701,6 @@
         </w:rPr>
         <w:t xml:space="preserve"> con </w:t>
       </w:r>
-      <w:proofErr w:type="spellStart"/>
       <w:r>
         <w:rPr>
           <w:rFonts w:ascii="Arial" w:hAnsi="Arial" w:cs="Arial"/>
@@ -3006,7 +2712,6 @@
         </w:rPr>
         <w:t>TypeScript</w:t>
       </w:r>
-      <w:proofErr w:type="spellEnd"/>
       <w:r>
         <w:rPr>
           <w:rFonts w:ascii="Arial" w:hAnsi="Arial" w:cs="Arial"/>
@@ -3016,43 +2721,17 @@
         </w:rPr>
         <w:t xml:space="preserve">, para brindar una experiencia de usuario fluida, similar a una aplicación de escritorio. Se emplearán librerías de componentes como </w:t>
       </w:r>
-      <w:proofErr w:type="spellStart"/>
-      <w:r>
-        <w:rPr>
-          <w:rFonts w:ascii="Arial" w:hAnsi="Arial" w:cs="Arial"/>
-          <w:b/>
-          <w:bCs/>
-          <w:sz w:val="21"/>
-          <w:szCs w:val="21"/>
-          <w:lang w:val="es-PE"/>
-        </w:rPr>
-        <w:t>PrimeNG</w:t>
-      </w:r>
-      <w:proofErr w:type="spellEnd"/>
-      <w:r>
-        <w:rPr>
-          <w:rFonts w:ascii="Arial" w:hAnsi="Arial" w:cs="Arial"/>
-          <w:b/>
-          <w:bCs/>
-          <w:sz w:val="21"/>
-          <w:szCs w:val="21"/>
-          <w:lang w:val="es-PE"/>
-        </w:rPr>
-        <w:t xml:space="preserve">, Bootstrap 5 y Material </w:t>
-      </w:r>
-      <w:proofErr w:type="spellStart"/>
-      <w:r>
-        <w:rPr>
-          <w:rFonts w:ascii="Arial" w:hAnsi="Arial" w:cs="Arial"/>
-          <w:b/>
-          <w:bCs/>
-          <w:sz w:val="21"/>
-          <w:szCs w:val="21"/>
-          <w:lang w:val="es-PE"/>
-        </w:rPr>
-        <w:t>Design</w:t>
-      </w:r>
-      <w:proofErr w:type="spellEnd"/>
+      <w:r>
+        <w:rPr>
+          <w:rFonts w:ascii="Arial" w:hAnsi="Arial" w:cs="Arial"/>
+          <w:b/>
+          <w:bCs/>
+          <w:sz w:val="21"/>
+          <w:szCs w:val="21"/>
+          <w:lang w:val="es-PE"/>
+        </w:rPr>
+        <w:t>PrimeNG, Bootstrap 5 y Material Design</w:t>
+      </w:r>
       <w:r>
         <w:rPr>
           <w:rFonts w:ascii="Arial" w:hAnsi="Arial" w:cs="Arial"/>
@@ -3091,33 +2770,7 @@
           <w:szCs w:val="21"/>
           <w:lang w:val="es-PE"/>
         </w:rPr>
-        <w:t>Servicios Lógicos (</w:t>
-      </w:r>
-      <w:proofErr w:type="spellStart"/>
-      <w:r>
-        <w:rPr>
-          <w:rFonts w:ascii="Arial" w:hAnsi="Arial" w:cs="Arial"/>
-          <w:b/>
-          <w:bCs/>
-          <w:color w:val="auto"/>
-          <w:sz w:val="21"/>
-          <w:szCs w:val="21"/>
-          <w:lang w:val="es-PE"/>
-        </w:rPr>
-        <w:t>Backend</w:t>
-      </w:r>
-      <w:proofErr w:type="spellEnd"/>
-      <w:r>
-        <w:rPr>
-          <w:rFonts w:ascii="Arial" w:hAnsi="Arial" w:cs="Arial"/>
-          <w:b/>
-          <w:bCs/>
-          <w:color w:val="auto"/>
-          <w:sz w:val="21"/>
-          <w:szCs w:val="21"/>
-          <w:lang w:val="es-PE"/>
-        </w:rPr>
-        <w:t>)</w:t>
+        <w:t>Servicios Lógicos (Backend)</w:t>
       </w:r>
     </w:p>
     <w:p>
@@ -3159,27 +2812,7 @@
           <w:szCs w:val="21"/>
           <w:lang w:val="es-PE"/>
         </w:rPr>
-        <w:t xml:space="preserve"> utilizando el </w:t>
-      </w:r>
-      <w:proofErr w:type="spellStart"/>
-      <w:r>
-        <w:rPr>
-          <w:rFonts w:ascii="Arial" w:hAnsi="Arial" w:cs="Arial"/>
-          <w:sz w:val="21"/>
-          <w:szCs w:val="21"/>
-          <w:lang w:val="es-PE"/>
-        </w:rPr>
-        <w:t>framework</w:t>
-      </w:r>
-      <w:proofErr w:type="spellEnd"/>
-      <w:r>
-        <w:rPr>
-          <w:rFonts w:ascii="Arial" w:hAnsi="Arial" w:cs="Arial"/>
-          <w:sz w:val="21"/>
-          <w:szCs w:val="21"/>
-          <w:lang w:val="es-PE"/>
-        </w:rPr>
-        <w:t> </w:t>
+        <w:t> utilizando el framework </w:t>
       </w:r>
       <w:r>
         <w:rPr>
@@ -3199,27 +2832,7 @@
           <w:szCs w:val="21"/>
           <w:lang w:val="es-PE"/>
         </w:rPr>
-        <w:t xml:space="preserve">. La exposición pública de las </w:t>
-      </w:r>
-      <w:proofErr w:type="spellStart"/>
-      <w:r>
-        <w:rPr>
-          <w:rFonts w:ascii="Arial" w:hAnsi="Arial" w:cs="Arial"/>
-          <w:sz w:val="21"/>
-          <w:szCs w:val="21"/>
-          <w:lang w:val="es-PE"/>
-        </w:rPr>
-        <w:t>APIs</w:t>
-      </w:r>
-      <w:proofErr w:type="spellEnd"/>
-      <w:r>
-        <w:rPr>
-          <w:rFonts w:ascii="Arial" w:hAnsi="Arial" w:cs="Arial"/>
-          <w:sz w:val="21"/>
-          <w:szCs w:val="21"/>
-          <w:lang w:val="es-PE"/>
-        </w:rPr>
-        <w:t xml:space="preserve"> se realiza a través de </w:t>
+        <w:t>. La exposición pública de las APIs se realiza a través de </w:t>
       </w:r>
       <w:r>
         <w:rPr>
@@ -3241,7 +2854,6 @@
         </w:rPr>
         <w:t> (generando y enviando cabeceras </w:t>
       </w:r>
-      <w:proofErr w:type="spellStart"/>
       <w:r>
         <w:rPr>
           <w:rFonts w:ascii="Arial" w:hAnsi="Arial" w:cs="Arial"/>
@@ -3253,7 +2865,6 @@
         </w:rPr>
         <w:t>traceparent</w:t>
       </w:r>
-      <w:proofErr w:type="spellEnd"/>
       <w:r>
         <w:rPr>
           <w:rFonts w:ascii="Arial" w:hAnsi="Arial" w:cs="Arial"/>
@@ -3279,49 +2890,8 @@
           <w:szCs w:val="21"/>
           <w:lang w:val="es-PE"/>
         </w:rPr>
-        <w:t xml:space="preserve"> (NGINX) en el clúster. El núcleo del sistema estará contenido en el microservicio oris-cas-central, acompañado de servicios complementarios bajo el esquema oris-</w:t>
-      </w:r>
-      <w:proofErr w:type="spellStart"/>
-      <w:r>
-        <w:rPr>
-          <w:rFonts w:ascii="Arial" w:hAnsi="Arial" w:cs="Arial"/>
-          <w:sz w:val="21"/>
-          <w:szCs w:val="21"/>
-          <w:lang w:val="es-PE"/>
-        </w:rPr>
-        <w:t>business</w:t>
-      </w:r>
-      <w:proofErr w:type="spellEnd"/>
-      <w:r>
-        <w:rPr>
-          <w:rFonts w:ascii="Arial" w:hAnsi="Arial" w:cs="Arial"/>
-          <w:sz w:val="21"/>
-          <w:szCs w:val="21"/>
-          <w:lang w:val="es-PE"/>
-        </w:rPr>
-        <w:t xml:space="preserve">-*. La </w:t>
-      </w:r>
-      <w:proofErr w:type="spellStart"/>
-      <w:r>
-        <w:rPr>
-          <w:rFonts w:ascii="Arial" w:hAnsi="Arial" w:cs="Arial"/>
-          <w:sz w:val="21"/>
-          <w:szCs w:val="21"/>
-          <w:lang w:val="es-PE"/>
-        </w:rPr>
-        <w:t>observabilidad</w:t>
-      </w:r>
-      <w:proofErr w:type="spellEnd"/>
-      <w:r>
-        <w:rPr>
-          <w:rFonts w:ascii="Arial" w:hAnsi="Arial" w:cs="Arial"/>
-          <w:sz w:val="21"/>
-          <w:szCs w:val="21"/>
-          <w:lang w:val="es-PE"/>
-        </w:rPr>
-        <w:t xml:space="preserve"> de los </w:t>
-      </w:r>
-      <w:proofErr w:type="spellStart"/>
+        <w:t xml:space="preserve"> (NGINX) en el clúster. El núcleo del sistema estará contenido en el microservicio oris-cas-central, acompañado de servicios complementarios bajo el esquema oris-business-*. La observabilidad de los </w:t>
+      </w:r>
       <w:r>
         <w:rPr>
           <w:rFonts w:ascii="Arial" w:hAnsi="Arial" w:cs="Arial"/>
@@ -3333,7 +2903,6 @@
         </w:rPr>
         <w:t>Pods</w:t>
       </w:r>
-      <w:proofErr w:type="spellEnd"/>
       <w:r>
         <w:rPr>
           <w:rFonts w:ascii="Arial" w:hAnsi="Arial" w:cs="Arial"/>
@@ -3343,29 +2912,16 @@
         </w:rPr>
         <w:t> se garantiza inyectando </w:t>
       </w:r>
-      <w:proofErr w:type="spellStart"/>
-      <w:r>
-        <w:rPr>
-          <w:rFonts w:ascii="Arial" w:hAnsi="Arial" w:cs="Arial"/>
-          <w:b/>
-          <w:bCs/>
-          <w:sz w:val="21"/>
-          <w:szCs w:val="21"/>
-          <w:lang w:val="es-PE"/>
-        </w:rPr>
-        <w:t>OTel</w:t>
-      </w:r>
-      <w:proofErr w:type="spellEnd"/>
-      <w:r>
-        <w:rPr>
-          <w:rFonts w:ascii="Arial" w:hAnsi="Arial" w:cs="Arial"/>
-          <w:b/>
-          <w:bCs/>
-          <w:sz w:val="21"/>
-          <w:szCs w:val="21"/>
-          <w:lang w:val="es-PE"/>
-        </w:rPr>
-        <w:t xml:space="preserve"> Java Agent</w:t>
+      <w:r>
+        <w:rPr>
+          <w:rFonts w:ascii="Arial" w:hAnsi="Arial" w:cs="Arial"/>
+          <w:b/>
+          <w:bCs/>
+          <w:sz w:val="21"/>
+          <w:szCs w:val="21"/>
+          <w:lang w:val="es-PE"/>
+        </w:rPr>
+        <w:t>OTel Java Agent</w:t>
       </w:r>
       <w:r>
         <w:rPr>
@@ -3385,45 +2941,8 @@
           <w:szCs w:val="21"/>
           <w:lang w:val="es-PE"/>
         </w:rPr>
-        <w:t xml:space="preserve">Azure </w:t>
-      </w:r>
-      <w:proofErr w:type="spellStart"/>
-      <w:r>
-        <w:rPr>
-          <w:rFonts w:ascii="Arial" w:hAnsi="Arial" w:cs="Arial"/>
-          <w:b/>
-          <w:bCs/>
-          <w:sz w:val="21"/>
-          <w:szCs w:val="21"/>
-          <w:lang w:val="es-PE"/>
-        </w:rPr>
-        <w:t>Application</w:t>
-      </w:r>
-      <w:proofErr w:type="spellEnd"/>
-      <w:r>
-        <w:rPr>
-          <w:rFonts w:ascii="Arial" w:hAnsi="Arial" w:cs="Arial"/>
-          <w:b/>
-          <w:bCs/>
-          <w:sz w:val="21"/>
-          <w:szCs w:val="21"/>
-          <w:lang w:val="es-PE"/>
-        </w:rPr>
-        <w:t xml:space="preserve"> </w:t>
-      </w:r>
-      <w:proofErr w:type="spellStart"/>
-      <w:r>
-        <w:rPr>
-          <w:rFonts w:ascii="Arial" w:hAnsi="Arial" w:cs="Arial"/>
-          <w:b/>
-          <w:bCs/>
-          <w:sz w:val="21"/>
-          <w:szCs w:val="21"/>
-          <w:lang w:val="es-PE"/>
-        </w:rPr>
-        <w:t>Insights</w:t>
-      </w:r>
-      <w:proofErr w:type="spellEnd"/>
+        <w:t>Azure Application Insights</w:t>
+      </w:r>
       <w:r>
         <w:rPr>
           <w:rFonts w:ascii="Arial" w:hAnsi="Arial" w:cs="Arial"/>
@@ -3491,31 +3010,7 @@
           <w:szCs w:val="21"/>
           <w:lang w:val="es-PE"/>
         </w:rPr>
-        <w:t xml:space="preserve">Patrón </w:t>
-      </w:r>
-      <w:proofErr w:type="spellStart"/>
-      <w:r>
-        <w:rPr>
-          <w:rFonts w:ascii="Arial" w:hAnsi="Arial" w:cs="Arial"/>
-          <w:b/>
-          <w:bCs/>
-          <w:sz w:val="21"/>
-          <w:szCs w:val="21"/>
-          <w:lang w:val="es-PE"/>
-        </w:rPr>
-        <w:t>Strategy</w:t>
-      </w:r>
-      <w:proofErr w:type="spellEnd"/>
-      <w:r>
-        <w:rPr>
-          <w:rFonts w:ascii="Arial" w:hAnsi="Arial" w:cs="Arial"/>
-          <w:b/>
-          <w:bCs/>
-          <w:sz w:val="21"/>
-          <w:szCs w:val="21"/>
-          <w:lang w:val="es-PE"/>
-        </w:rPr>
-        <w:t>:</w:t>
+        <w:t>Patrón Strategy:</w:t>
       </w:r>
       <w:r>
         <w:rPr>
@@ -3587,31 +3082,7 @@
           <w:szCs w:val="21"/>
           <w:lang w:val="es-PE"/>
         </w:rPr>
-        <w:t xml:space="preserve">DAO / </w:t>
-      </w:r>
-      <w:proofErr w:type="spellStart"/>
-      <w:r>
-        <w:rPr>
-          <w:rFonts w:ascii="Arial" w:hAnsi="Arial" w:cs="Arial"/>
-          <w:b/>
-          <w:bCs/>
-          <w:sz w:val="21"/>
-          <w:szCs w:val="21"/>
-          <w:lang w:val="es-PE"/>
-        </w:rPr>
-        <w:t>Repository</w:t>
-      </w:r>
-      <w:proofErr w:type="spellEnd"/>
-      <w:r>
-        <w:rPr>
-          <w:rFonts w:ascii="Arial" w:hAnsi="Arial" w:cs="Arial"/>
-          <w:b/>
-          <w:bCs/>
-          <w:sz w:val="21"/>
-          <w:szCs w:val="21"/>
-          <w:lang w:val="es-PE"/>
-        </w:rPr>
-        <w:t>:</w:t>
+        <w:t>DAO / Repository:</w:t>
       </w:r>
       <w:r>
         <w:rPr>
@@ -3734,51 +3205,7 @@
           <w:szCs w:val="21"/>
           <w:lang w:val="es-PE"/>
         </w:rPr>
-        <w:t xml:space="preserve">Azure </w:t>
-      </w:r>
-      <w:proofErr w:type="spellStart"/>
-      <w:r>
-        <w:rPr>
-          <w:rStyle w:val="Fuerte"/>
-          <w:rFonts w:ascii="Arial" w:hAnsi="Arial" w:cs="Arial"/>
-          <w:sz w:val="21"/>
-          <w:szCs w:val="21"/>
-          <w:lang w:val="es-PE"/>
-        </w:rPr>
-        <w:t>Database</w:t>
-      </w:r>
-      <w:proofErr w:type="spellEnd"/>
-      <w:r>
-        <w:rPr>
-          <w:rStyle w:val="Fuerte"/>
-          <w:rFonts w:ascii="Arial" w:hAnsi="Arial" w:cs="Arial"/>
-          <w:sz w:val="21"/>
-          <w:szCs w:val="21"/>
-          <w:lang w:val="es-PE"/>
-        </w:rPr>
-        <w:t xml:space="preserve"> </w:t>
-      </w:r>
-      <w:proofErr w:type="spellStart"/>
-      <w:r>
-        <w:rPr>
-          <w:rStyle w:val="Fuerte"/>
-          <w:rFonts w:ascii="Arial" w:hAnsi="Arial" w:cs="Arial"/>
-          <w:sz w:val="21"/>
-          <w:szCs w:val="21"/>
-          <w:lang w:val="es-PE"/>
-        </w:rPr>
-        <w:t>for</w:t>
-      </w:r>
-      <w:proofErr w:type="spellEnd"/>
-      <w:r>
-        <w:rPr>
-          <w:rStyle w:val="Fuerte"/>
-          <w:rFonts w:ascii="Arial" w:hAnsi="Arial" w:cs="Arial"/>
-          <w:sz w:val="21"/>
-          <w:szCs w:val="21"/>
-          <w:lang w:val="es-PE"/>
-        </w:rPr>
-        <w:t xml:space="preserve"> PostgreSQL Flexible Server</w:t>
+        <w:t>Azure Database for PostgreSQL Flexible Server</w:t>
       </w:r>
       <w:r>
         <w:rPr>
@@ -3825,67 +3252,7 @@
           <w:szCs w:val="21"/>
           <w:lang w:val="es-PE"/>
         </w:rPr>
-        <w:t xml:space="preserve"> configurado con Geo-replicación mediante </w:t>
-      </w:r>
-      <w:proofErr w:type="spellStart"/>
-      <w:r>
-        <w:rPr>
-          <w:rFonts w:ascii="Arial" w:hAnsi="Arial" w:cs="Arial"/>
-          <w:sz w:val="21"/>
-          <w:szCs w:val="21"/>
-          <w:lang w:val="es-PE"/>
-        </w:rPr>
-        <w:t>Peering</w:t>
-      </w:r>
-      <w:proofErr w:type="spellEnd"/>
-      <w:r>
-        <w:rPr>
-          <w:rFonts w:ascii="Arial" w:hAnsi="Arial" w:cs="Arial"/>
-          <w:sz w:val="21"/>
-          <w:szCs w:val="21"/>
-          <w:lang w:val="es-PE"/>
-        </w:rPr>
-        <w:t xml:space="preserve"> de redes (</w:t>
-      </w:r>
-      <w:proofErr w:type="gramStart"/>
-      <w:r>
-        <w:rPr>
-          <w:rFonts w:ascii="Arial" w:hAnsi="Arial" w:cs="Arial"/>
-          <w:sz w:val="21"/>
-          <w:szCs w:val="21"/>
-          <w:lang w:val="es-PE"/>
-        </w:rPr>
-        <w:t>Hub</w:t>
-      </w:r>
-      <w:proofErr w:type="gramEnd"/>
-      <w:r>
-        <w:rPr>
-          <w:rFonts w:ascii="Arial" w:hAnsi="Arial" w:cs="Arial"/>
-          <w:sz w:val="21"/>
-          <w:szCs w:val="21"/>
-          <w:lang w:val="es-PE"/>
-        </w:rPr>
-        <w:t>-</w:t>
-      </w:r>
-      <w:proofErr w:type="spellStart"/>
-      <w:r>
-        <w:rPr>
-          <w:rFonts w:ascii="Arial" w:hAnsi="Arial" w:cs="Arial"/>
-          <w:sz w:val="21"/>
-          <w:szCs w:val="21"/>
-          <w:lang w:val="es-PE"/>
-        </w:rPr>
-        <w:t>Spoke</w:t>
-      </w:r>
-      <w:proofErr w:type="spellEnd"/>
-      <w:r>
-        <w:rPr>
-          <w:rFonts w:ascii="Arial" w:hAnsi="Arial" w:cs="Arial"/>
-          <w:sz w:val="21"/>
-          <w:szCs w:val="21"/>
-          <w:lang w:val="es-PE"/>
-        </w:rPr>
-        <w:t>).</w:t>
+        <w:t> configurado con Geo-replicación mediante Peering de redes (Hub-Spoke).</w:t>
       </w:r>
     </w:p>
     <w:p>
@@ -3930,9 +3297,17 @@
           <w:szCs w:val="21"/>
           <w:lang w:val="es-PE"/>
         </w:rPr>
-        <w:t xml:space="preserve">Azure </w:t>
-      </w:r>
-      <w:proofErr w:type="spellStart"/>
+        <w:t>Azure Kubernetes Service (AKS)</w:t>
+      </w:r>
+      <w:r>
+        <w:rPr>
+          <w:rFonts w:ascii="Arial" w:hAnsi="Arial" w:cs="Arial"/>
+          <w:sz w:val="21"/>
+          <w:szCs w:val="21"/>
+          <w:lang w:val="es-PE"/>
+        </w:rPr>
+        <w:t> distribuido en redes virtuales Spoke (Dev, Cert, Prod) para alta disponibilidad. Las imágenes (contenedores) de la aplicación se almacenarán y extraerán desde </w:t>
+      </w:r>
       <w:r>
         <w:rPr>
           <w:rStyle w:val="Fuerte"/>
@@ -3941,148 +3316,16 @@
           <w:szCs w:val="21"/>
           <w:lang w:val="es-PE"/>
         </w:rPr>
-        <w:t>Kubernetes</w:t>
-      </w:r>
-      <w:proofErr w:type="spellEnd"/>
-      <w:r>
-        <w:rPr>
-          <w:rStyle w:val="Fuerte"/>
-          <w:rFonts w:ascii="Arial" w:hAnsi="Arial" w:cs="Arial"/>
-          <w:sz w:val="21"/>
-          <w:szCs w:val="21"/>
-          <w:lang w:val="es-PE"/>
-        </w:rPr>
-        <w:t xml:space="preserve"> Service (AKS)</w:t>
-      </w:r>
-      <w:r>
-        <w:rPr>
-          <w:rFonts w:ascii="Arial" w:hAnsi="Arial" w:cs="Arial"/>
-          <w:sz w:val="21"/>
-          <w:szCs w:val="21"/>
-          <w:lang w:val="es-PE"/>
-        </w:rPr>
-        <w:t xml:space="preserve"> distribuido en redes virtuales </w:t>
-      </w:r>
-      <w:proofErr w:type="spellStart"/>
-      <w:r>
-        <w:rPr>
-          <w:rFonts w:ascii="Arial" w:hAnsi="Arial" w:cs="Arial"/>
-          <w:sz w:val="21"/>
-          <w:szCs w:val="21"/>
-          <w:lang w:val="es-PE"/>
-        </w:rPr>
-        <w:t>Spoke</w:t>
-      </w:r>
-      <w:proofErr w:type="spellEnd"/>
-      <w:r>
-        <w:rPr>
-          <w:rFonts w:ascii="Arial" w:hAnsi="Arial" w:cs="Arial"/>
-          <w:sz w:val="21"/>
-          <w:szCs w:val="21"/>
-          <w:lang w:val="es-PE"/>
-        </w:rPr>
-        <w:t xml:space="preserve"> (Dev, </w:t>
-      </w:r>
-      <w:proofErr w:type="spellStart"/>
-      <w:r>
-        <w:rPr>
-          <w:rFonts w:ascii="Arial" w:hAnsi="Arial" w:cs="Arial"/>
-          <w:sz w:val="21"/>
-          <w:szCs w:val="21"/>
-          <w:lang w:val="es-PE"/>
-        </w:rPr>
-        <w:t>Cert</w:t>
-      </w:r>
-      <w:proofErr w:type="spellEnd"/>
-      <w:r>
-        <w:rPr>
-          <w:rFonts w:ascii="Arial" w:hAnsi="Arial" w:cs="Arial"/>
-          <w:sz w:val="21"/>
-          <w:szCs w:val="21"/>
-          <w:lang w:val="es-PE"/>
-        </w:rPr>
-        <w:t xml:space="preserve">, </w:t>
-      </w:r>
-      <w:proofErr w:type="spellStart"/>
-      <w:r>
-        <w:rPr>
-          <w:rFonts w:ascii="Arial" w:hAnsi="Arial" w:cs="Arial"/>
-          <w:sz w:val="21"/>
-          <w:szCs w:val="21"/>
-          <w:lang w:val="es-PE"/>
-        </w:rPr>
-        <w:t>Prod</w:t>
-      </w:r>
-      <w:proofErr w:type="spellEnd"/>
-      <w:r>
-        <w:rPr>
-          <w:rFonts w:ascii="Arial" w:hAnsi="Arial" w:cs="Arial"/>
-          <w:sz w:val="21"/>
-          <w:szCs w:val="21"/>
-          <w:lang w:val="es-PE"/>
-        </w:rPr>
-        <w:t>) para alta disponibilidad. Las imágenes (contenedores) de la aplicación se almacenarán y extraerán desde </w:t>
-      </w:r>
-      <w:r>
-        <w:rPr>
-          <w:rStyle w:val="Fuerte"/>
-          <w:rFonts w:ascii="Arial" w:hAnsi="Arial" w:cs="Arial"/>
-          <w:sz w:val="21"/>
-          <w:szCs w:val="21"/>
-          <w:lang w:val="es-PE"/>
-        </w:rPr>
-        <w:t xml:space="preserve">Azure Container </w:t>
-      </w:r>
-      <w:proofErr w:type="spellStart"/>
-      <w:r>
-        <w:rPr>
-          <w:rStyle w:val="Fuerte"/>
-          <w:rFonts w:ascii="Arial" w:hAnsi="Arial" w:cs="Arial"/>
-          <w:sz w:val="21"/>
-          <w:szCs w:val="21"/>
-          <w:lang w:val="es-PE"/>
-        </w:rPr>
-        <w:t>Registry</w:t>
-      </w:r>
-      <w:proofErr w:type="spellEnd"/>
-      <w:r>
-        <w:rPr>
-          <w:rStyle w:val="Fuerte"/>
-          <w:rFonts w:ascii="Arial" w:hAnsi="Arial" w:cs="Arial"/>
-          <w:sz w:val="21"/>
-          <w:szCs w:val="21"/>
-          <w:lang w:val="es-PE"/>
-        </w:rPr>
-        <w:t xml:space="preserve"> (ACR)</w:t>
-      </w:r>
-      <w:r>
-        <w:rPr>
-          <w:rFonts w:ascii="Arial" w:hAnsi="Arial" w:cs="Arial"/>
-          <w:sz w:val="21"/>
-          <w:szCs w:val="21"/>
-          <w:lang w:val="es-PE"/>
-        </w:rPr>
-        <w:t xml:space="preserve"> a través de Private </w:t>
-      </w:r>
-      <w:proofErr w:type="spellStart"/>
-      <w:r>
-        <w:rPr>
-          <w:rFonts w:ascii="Arial" w:hAnsi="Arial" w:cs="Arial"/>
-          <w:sz w:val="21"/>
-          <w:szCs w:val="21"/>
-          <w:lang w:val="es-PE"/>
-        </w:rPr>
-        <w:t>Endpoints</w:t>
-      </w:r>
-      <w:proofErr w:type="spellEnd"/>
-      <w:r>
-        <w:rPr>
-          <w:rFonts w:ascii="Arial" w:hAnsi="Arial" w:cs="Arial"/>
-          <w:sz w:val="21"/>
-          <w:szCs w:val="21"/>
-          <w:lang w:val="es-PE"/>
-        </w:rPr>
-        <w:t xml:space="preserve"> (</w:t>
+        <w:t>Azure Container Registry (ACR)</w:t>
+      </w:r>
+      <w:r>
+        <w:rPr>
+          <w:rFonts w:ascii="Arial" w:hAnsi="Arial" w:cs="Arial"/>
+          <w:sz w:val="21"/>
+          <w:szCs w:val="21"/>
+          <w:lang w:val="es-PE"/>
+        </w:rPr>
+        <w:t> a través de Private Endpoints (</w:t>
       </w:r>
       <w:r>
         <w:rPr>
@@ -4155,27 +3398,7 @@
           <w:szCs w:val="21"/>
           <w:lang w:val="es-PE"/>
         </w:rPr>
-        <w:t xml:space="preserve"> vía Private </w:t>
-      </w:r>
-      <w:proofErr w:type="spellStart"/>
-      <w:r>
-        <w:rPr>
-          <w:rFonts w:ascii="Arial" w:hAnsi="Arial" w:cs="Arial"/>
-          <w:sz w:val="21"/>
-          <w:szCs w:val="21"/>
-          <w:lang w:val="es-PE"/>
-        </w:rPr>
-        <w:t>Endpoints</w:t>
-      </w:r>
-      <w:proofErr w:type="spellEnd"/>
-      <w:r>
-        <w:rPr>
-          <w:rFonts w:ascii="Arial" w:hAnsi="Arial" w:cs="Arial"/>
-          <w:sz w:val="21"/>
-          <w:szCs w:val="21"/>
-          <w:lang w:val="es-PE"/>
-        </w:rPr>
-        <w:t xml:space="preserve"> (</w:t>
+        <w:t> vía Private Endpoints (</w:t>
       </w:r>
       <w:r>
         <w:rPr>
@@ -4239,9 +3462,17 @@
           <w:szCs w:val="21"/>
           <w:lang w:val="es-PE"/>
         </w:rPr>
-        <w:t xml:space="preserve">GitHub </w:t>
-      </w:r>
-      <w:proofErr w:type="spellStart"/>
+        <w:t>GitHub Actions</w:t>
+      </w:r>
+      <w:r>
+        <w:rPr>
+          <w:rFonts w:ascii="Arial" w:hAnsi="Arial" w:cs="Arial"/>
+          <w:sz w:val="21"/>
+          <w:szCs w:val="21"/>
+          <w:lang w:val="es-PE"/>
+        </w:rPr>
+        <w:t> hacia el ACR, interconectándose luego con </w:t>
+      </w:r>
       <w:r>
         <w:rPr>
           <w:rStyle w:val="Fuerte"/>
@@ -4250,30 +3481,8 @@
           <w:szCs w:val="21"/>
           <w:lang w:val="es-PE"/>
         </w:rPr>
-        <w:t>Actions</w:t>
-      </w:r>
-      <w:proofErr w:type="spellEnd"/>
-      <w:r>
-        <w:rPr>
-          <w:rFonts w:ascii="Arial" w:hAnsi="Arial" w:cs="Arial"/>
-          <w:sz w:val="21"/>
-          <w:szCs w:val="21"/>
-          <w:lang w:val="es-PE"/>
-        </w:rPr>
-        <w:t> hacia el ACR, interconectándose luego con </w:t>
-      </w:r>
-      <w:proofErr w:type="spellStart"/>
-      <w:r>
-        <w:rPr>
-          <w:rStyle w:val="Fuerte"/>
-          <w:rFonts w:ascii="Arial" w:hAnsi="Arial" w:cs="Arial"/>
-          <w:sz w:val="21"/>
-          <w:szCs w:val="21"/>
-          <w:lang w:val="es-PE"/>
-        </w:rPr>
         <w:t>ArgoCD</w:t>
       </w:r>
-      <w:proofErr w:type="spellEnd"/>
       <w:r>
         <w:rPr>
           <w:rFonts w:ascii="Arial" w:hAnsi="Arial" w:cs="Arial"/>
@@ -4282,6 +3491,72 @@
           <w:lang w:val="es-PE"/>
         </w:rPr>
         <w:t> para la actualización declarativa de los entornos AKS.</w:t>
+      </w:r>
+    </w:p>
+    <w:p>
+      <w:pPr>
+        <w:spacing w:before="100" w:beforeAutospacing="1" w:after="100" w:afterAutospacing="1"/>
+        <w:ind w:left="142"/>
+        <w:rPr>
+          <w:rFonts w:ascii="Times New Roman" w:eastAsia="Times New Roman" w:hAnsi="Times New Roman" w:cs="Times New Roman"/>
+          <w:lang w:val="es-ES" w:eastAsia="es-ES"/>
+        </w:rPr>
+      </w:pPr>
+      <w:r>
+        <w:rPr>
+          <w:rFonts w:eastAsia="Times New Roman"/>
+          <w:noProof/>
+          <w:lang w:val="es-ES" w:eastAsia="es-ES"/>
+        </w:rPr>
+        <w:lastRenderedPageBreak/>
+        <w:drawing>
+          <wp:inline distT="0" distB="0" distL="0" distR="0" wp14:anchorId="2A115BD5" wp14:editId="024455FA">
+            <wp:extent cx="5787956" cy="4368800"/>
+            <wp:effectExtent l="0" t="0" r="3810" b="0"/>
+            <wp:docPr id="1845124488" name="Imagen 7" descr="Diagrama, Esquemático&#10;&#10;El contenido generado por IA puede ser incorrecto."/>
+            <wp:cNvGraphicFramePr>
+              <a:graphicFrameLocks xmlns:a="http://schemas.openxmlformats.org/drawingml/2006/main" noChangeAspect="1"/>
+            </wp:cNvGraphicFramePr>
+            <a:graphic xmlns:a="http://schemas.openxmlformats.org/drawingml/2006/main">
+              <a:graphicData uri="http://schemas.openxmlformats.org/drawingml/2006/picture">
+                <pic:pic xmlns:pic="http://schemas.openxmlformats.org/drawingml/2006/picture">
+                  <pic:nvPicPr>
+                    <pic:cNvPr id="1845124488" name="Imagen 7" descr="Diagrama, Esquemático&#10;&#10;El contenido generado por IA puede ser incorrecto."/>
+                    <pic:cNvPicPr>
+                      <a:picLocks noChangeAspect="1" noChangeArrowheads="1"/>
+                    </pic:cNvPicPr>
+                  </pic:nvPicPr>
+                  <pic:blipFill>
+                    <a:blip r:embed="rId12" cstate="print">
+                      <a:extLst>
+                        <a:ext uri="{28A0092B-C50C-407E-A947-70E740481C1C}">
+                          <a14:useLocalDpi xmlns:a14="http://schemas.microsoft.com/office/drawing/2010/main" val="0"/>
+                        </a:ext>
+                      </a:extLst>
+                    </a:blip>
+                    <a:srcRect/>
+                    <a:stretch>
+                      <a:fillRect/>
+                    </a:stretch>
+                  </pic:blipFill>
+                  <pic:spPr bwMode="auto">
+                    <a:xfrm>
+                      <a:off x="0" y="0"/>
+                      <a:ext cx="5793486" cy="4372974"/>
+                    </a:xfrm>
+                    <a:prstGeom prst="rect">
+                      <a:avLst/>
+                    </a:prstGeom>
+                    <a:noFill/>
+                    <a:ln>
+                      <a:noFill/>
+                    </a:ln>
+                  </pic:spPr>
+                </pic:pic>
+              </a:graphicData>
+            </a:graphic>
+          </wp:inline>
+        </w:drawing>
       </w:r>
     </w:p>
     <w:p>
@@ -4341,47 +3616,7 @@
           <w:szCs w:val="21"/>
           <w:lang w:val="en-US"/>
         </w:rPr>
-        <w:t xml:space="preserve">El </w:t>
-      </w:r>
-      <w:proofErr w:type="gramStart"/>
-      <w:r>
-        <w:rPr>
-          <w:rFonts w:ascii="Arial" w:hAnsi="Arial" w:cs="Arial"/>
-          <w:sz w:val="21"/>
-          <w:szCs w:val="21"/>
-          <w:lang w:val="en-US"/>
-        </w:rPr>
-        <w:t>Back-End</w:t>
-      </w:r>
-      <w:proofErr w:type="gramEnd"/>
-      <w:r>
-        <w:rPr>
-          <w:rFonts w:ascii="Arial" w:hAnsi="Arial" w:cs="Arial"/>
-          <w:sz w:val="21"/>
-          <w:szCs w:val="21"/>
-          <w:lang w:val="en-US"/>
-        </w:rPr>
-        <w:t xml:space="preserve"> </w:t>
-      </w:r>
-      <w:proofErr w:type="spellStart"/>
-      <w:r>
-        <w:rPr>
-          <w:rFonts w:ascii="Arial" w:hAnsi="Arial" w:cs="Arial"/>
-          <w:sz w:val="21"/>
-          <w:szCs w:val="21"/>
-          <w:lang w:val="en-US"/>
-        </w:rPr>
-        <w:t>requiere</w:t>
-      </w:r>
-      <w:proofErr w:type="spellEnd"/>
-      <w:r>
-        <w:rPr>
-          <w:rFonts w:ascii="Arial" w:hAnsi="Arial" w:cs="Arial"/>
-          <w:sz w:val="21"/>
-          <w:szCs w:val="21"/>
-          <w:lang w:val="en-US"/>
-        </w:rPr>
-        <w:t xml:space="preserve"> Spring Boot 3.4+ con Java LTS.</w:t>
+        <w:t>El Back-End requiere Spring Boot 3.4+ con Java LTS.</w:t>
       </w:r>
     </w:p>
     <w:p>
@@ -4431,27 +3666,7 @@
           <w:szCs w:val="21"/>
           <w:lang w:val="es-PE"/>
         </w:rPr>
-        <w:t xml:space="preserve">Cumplimiento estricto con la Ley de Protección de Datos Personales </w:t>
-      </w:r>
-      <w:proofErr w:type="spellStart"/>
-      <w:r>
-        <w:rPr>
-          <w:rFonts w:ascii="Arial" w:hAnsi="Arial" w:cs="Arial"/>
-          <w:sz w:val="21"/>
-          <w:szCs w:val="21"/>
-          <w:lang w:val="es-PE"/>
-        </w:rPr>
-        <w:t>N°</w:t>
-      </w:r>
-      <w:proofErr w:type="spellEnd"/>
-      <w:r>
-        <w:rPr>
-          <w:rFonts w:ascii="Arial" w:hAnsi="Arial" w:cs="Arial"/>
-          <w:sz w:val="21"/>
-          <w:szCs w:val="21"/>
-          <w:lang w:val="es-PE"/>
-        </w:rPr>
-        <w:t xml:space="preserve"> 29733 (datos sensibles anonimizados en pruebas).</w:t>
+        <w:t>Cumplimiento estricto con la Ley de Protección de Datos Personales N° 29733 (datos sensibles anonimizados en pruebas).</w:t>
       </w:r>
     </w:p>
     <w:p>
@@ -4505,9 +3720,17 @@
           <w:szCs w:val="21"/>
           <w:lang w:val="es-PE"/>
         </w:rPr>
-        <w:t xml:space="preserve">Azure </w:t>
-      </w:r>
-      <w:proofErr w:type="spellStart"/>
+        <w:t>Azure Kubernetes Service (AKS)</w:t>
+      </w:r>
+      <w:r>
+        <w:rPr>
+          <w:rFonts w:ascii="Arial" w:hAnsi="Arial" w:cs="Arial"/>
+          <w:sz w:val="21"/>
+          <w:szCs w:val="21"/>
+          <w:lang w:val="es-PE"/>
+        </w:rPr>
+        <w:t>, bases de datos </w:t>
+      </w:r>
       <w:r>
         <w:rPr>
           <w:rStyle w:val="Fuerte"/>
@@ -4516,36 +3739,6 @@
           <w:szCs w:val="21"/>
           <w:lang w:val="es-PE"/>
         </w:rPr>
-        <w:t>Kubernetes</w:t>
-      </w:r>
-      <w:proofErr w:type="spellEnd"/>
-      <w:r>
-        <w:rPr>
-          <w:rStyle w:val="Fuerte"/>
-          <w:rFonts w:ascii="Arial" w:hAnsi="Arial" w:cs="Arial"/>
-          <w:sz w:val="21"/>
-          <w:szCs w:val="21"/>
-          <w:lang w:val="es-PE"/>
-        </w:rPr>
-        <w:t xml:space="preserve"> Service (AKS)</w:t>
-      </w:r>
-      <w:r>
-        <w:rPr>
-          <w:rFonts w:ascii="Arial" w:hAnsi="Arial" w:cs="Arial"/>
-          <w:sz w:val="21"/>
-          <w:szCs w:val="21"/>
-          <w:lang w:val="es-PE"/>
-        </w:rPr>
-        <w:t>, bases de datos </w:t>
-      </w:r>
-      <w:r>
-        <w:rPr>
-          <w:rStyle w:val="Fuerte"/>
-          <w:rFonts w:ascii="Arial" w:hAnsi="Arial" w:cs="Arial"/>
-          <w:sz w:val="21"/>
-          <w:szCs w:val="21"/>
-          <w:lang w:val="es-PE"/>
-        </w:rPr>
         <w:t>PostgreSQL Flexible Server</w:t>
       </w:r>
       <w:r>
@@ -4555,39 +3748,8 @@
           <w:szCs w:val="21"/>
           <w:lang w:val="es-PE"/>
         </w:rPr>
-        <w:t xml:space="preserve">, y topología de red </w:t>
-      </w:r>
-      <w:proofErr w:type="gramStart"/>
-      <w:r>
-        <w:rPr>
-          <w:rFonts w:ascii="Arial" w:hAnsi="Arial" w:cs="Arial"/>
-          <w:sz w:val="21"/>
-          <w:szCs w:val="21"/>
-          <w:lang w:val="es-PE"/>
-        </w:rPr>
-        <w:t>Hub</w:t>
-      </w:r>
-      <w:proofErr w:type="gramEnd"/>
-      <w:r>
-        <w:rPr>
-          <w:rFonts w:ascii="Arial" w:hAnsi="Arial" w:cs="Arial"/>
-          <w:sz w:val="21"/>
-          <w:szCs w:val="21"/>
-          <w:lang w:val="es-PE"/>
-        </w:rPr>
-        <w:t>-</w:t>
-      </w:r>
-      <w:proofErr w:type="spellStart"/>
-      <w:r>
-        <w:rPr>
-          <w:rFonts w:ascii="Arial" w:hAnsi="Arial" w:cs="Arial"/>
-          <w:sz w:val="21"/>
-          <w:szCs w:val="21"/>
-          <w:lang w:val="es-PE"/>
-        </w:rPr>
-        <w:t>Spoke</w:t>
-      </w:r>
-      <w:proofErr w:type="spellEnd"/>
+        <w:t>, y topología de red Hub-Spoke</w:t>
+      </w:r>
     </w:p>
     <w:p>
       <w:pPr>
@@ -4621,7 +3783,6 @@
           <w:szCs w:val="21"/>
           <w:lang w:val="es-PE"/>
         </w:rPr>
-        <w:lastRenderedPageBreak/>
         <w:t>VISTA DE MÓDULOS DEL SISTEMA</w:t>
       </w:r>
     </w:p>
@@ -4666,6 +3827,7 @@
           <w:noProof/>
           <w:lang w:val="es-ES"/>
         </w:rPr>
+        <w:lastRenderedPageBreak/>
         <w:drawing>
           <wp:inline distT="0" distB="0" distL="0" distR="0" wp14:anchorId="268C3020" wp14:editId="4939F2C4">
             <wp:extent cx="6061075" cy="2183642"/>
@@ -4684,7 +3846,7 @@
                     </pic:cNvPicPr>
                   </pic:nvPicPr>
                   <pic:blipFill>
-                    <a:blip r:embed="rId11" cstate="print">
+                    <a:blip r:embed="rId13" cstate="print">
                       <a:extLst>
                         <a:ext uri="{28A0092B-C50C-407E-A947-70E740481C1C}">
                           <a14:useLocalDpi xmlns:a14="http://schemas.microsoft.com/office/drawing/2010/main" val="0"/>
@@ -4828,47 +3990,7 @@
           <w:szCs w:val="21"/>
           <w:lang w:val="es-PE"/>
         </w:rPr>
-        <w:t xml:space="preserve"> </w:t>
-      </w:r>
-      <w:proofErr w:type="spellStart"/>
-      <w:r>
-        <w:rPr>
-          <w:rFonts w:ascii="Arial" w:hAnsi="Arial" w:cs="Arial"/>
-          <w:sz w:val="21"/>
-          <w:szCs w:val="21"/>
-          <w:lang w:val="es-PE"/>
-        </w:rPr>
-        <w:t>Dashboard</w:t>
-      </w:r>
-      <w:proofErr w:type="spellEnd"/>
-      <w:r>
-        <w:rPr>
-          <w:rFonts w:ascii="Arial" w:hAnsi="Arial" w:cs="Arial"/>
-          <w:sz w:val="21"/>
-          <w:szCs w:val="21"/>
-          <w:lang w:val="es-PE"/>
-        </w:rPr>
-        <w:t xml:space="preserve"> interactivo y dinámico. Permite visualizar indicadores sociales a nivel departamental, provincial y distrital con filtros avanzados, comparativas y análisis nominal (drill-</w:t>
-      </w:r>
-      <w:proofErr w:type="spellStart"/>
-      <w:r>
-        <w:rPr>
-          <w:rFonts w:ascii="Arial" w:hAnsi="Arial" w:cs="Arial"/>
-          <w:sz w:val="21"/>
-          <w:szCs w:val="21"/>
-          <w:lang w:val="es-PE"/>
-        </w:rPr>
-        <w:t>down</w:t>
-      </w:r>
-      <w:proofErr w:type="spellEnd"/>
-      <w:r>
-        <w:rPr>
-          <w:rFonts w:ascii="Arial" w:hAnsi="Arial" w:cs="Arial"/>
-          <w:sz w:val="21"/>
-          <w:szCs w:val="21"/>
-          <w:lang w:val="es-PE"/>
-        </w:rPr>
-        <w:t>).</w:t>
+        <w:t xml:space="preserve"> Dashboard interactivo y dinámico. Permite visualizar indicadores sociales a nivel departamental, provincial y distrital con filtros avanzados, comparativas y análisis nominal (drill-down).</w:t>
       </w:r>
     </w:p>
     <w:p>
@@ -5081,27 +4203,7 @@
           <w:szCs w:val="21"/>
           <w:lang w:val="es-PE"/>
         </w:rPr>
-        <w:t xml:space="preserve">Unidad de Primera Infancia (Incluye </w:t>
-      </w:r>
-      <w:proofErr w:type="spellStart"/>
-      <w:r>
-        <w:rPr>
-          <w:rFonts w:ascii="Arial" w:hAnsi="Arial" w:cs="Arial"/>
-          <w:sz w:val="21"/>
-          <w:szCs w:val="21"/>
-          <w:lang w:val="es-PE"/>
-        </w:rPr>
-        <w:t>sub-módulo</w:t>
-      </w:r>
-      <w:proofErr w:type="spellEnd"/>
-      <w:r>
-        <w:rPr>
-          <w:rFonts w:ascii="Arial" w:hAnsi="Arial" w:cs="Arial"/>
-          <w:sz w:val="21"/>
-          <w:szCs w:val="21"/>
-          <w:lang w:val="es-PE"/>
-        </w:rPr>
-        <w:t xml:space="preserve"> para Pueblos Originarios, Comunidades y Rondas Campesinas).</w:t>
+        <w:t>Unidad de Primera Infancia (Incluye sub-módulo para Pueblos Originarios, Comunidades y Rondas Campesinas).</w:t>
       </w:r>
     </w:p>
     <w:p>
@@ -5386,7 +4488,7 @@
                           <pic:cNvPicPr/>
                         </pic:nvPicPr>
                         <pic:blipFill>
-                          <a:blip r:embed="rId12"/>
+                          <a:blip r:embed="rId14"/>
                           <a:stretch>
                             <a:fillRect/>
                           </a:stretch>
@@ -5520,7 +4622,7 @@
                           <pic:cNvPicPr/>
                         </pic:nvPicPr>
                         <pic:blipFill>
-                          <a:blip r:embed="rId13"/>
+                          <a:blip r:embed="rId15"/>
                           <a:stretch>
                             <a:fillRect/>
                           </a:stretch>
@@ -5691,55 +4793,7 @@
           <w:szCs w:val="21"/>
           <w:lang w:val="es-PE"/>
         </w:rPr>
-        <w:t>QA (</w:t>
-      </w:r>
-      <w:proofErr w:type="spellStart"/>
-      <w:r>
-        <w:rPr>
-          <w:rFonts w:ascii="Arial" w:hAnsi="Arial" w:cs="Arial"/>
-          <w:b/>
-          <w:bCs/>
-          <w:sz w:val="21"/>
-          <w:szCs w:val="21"/>
-          <w:lang w:val="es-PE"/>
-        </w:rPr>
-        <w:t>Quality</w:t>
-      </w:r>
-      <w:proofErr w:type="spellEnd"/>
-      <w:r>
-        <w:rPr>
-          <w:rFonts w:ascii="Arial" w:hAnsi="Arial" w:cs="Arial"/>
-          <w:b/>
-          <w:bCs/>
-          <w:sz w:val="21"/>
-          <w:szCs w:val="21"/>
-          <w:lang w:val="es-PE"/>
-        </w:rPr>
-        <w:t xml:space="preserve"> </w:t>
-      </w:r>
-      <w:proofErr w:type="spellStart"/>
-      <w:r>
-        <w:rPr>
-          <w:rFonts w:ascii="Arial" w:hAnsi="Arial" w:cs="Arial"/>
-          <w:b/>
-          <w:bCs/>
-          <w:sz w:val="21"/>
-          <w:szCs w:val="21"/>
-          <w:lang w:val="es-PE"/>
-        </w:rPr>
-        <w:t>Assurance</w:t>
-      </w:r>
-      <w:proofErr w:type="spellEnd"/>
-      <w:r>
-        <w:rPr>
-          <w:rFonts w:ascii="Arial" w:hAnsi="Arial" w:cs="Arial"/>
-          <w:b/>
-          <w:bCs/>
-          <w:sz w:val="21"/>
-          <w:szCs w:val="21"/>
-          <w:lang w:val="es-PE"/>
-        </w:rPr>
-        <w:t>):</w:t>
+        <w:t>QA (Quality Assurance):</w:t>
       </w:r>
       <w:r>
         <w:rPr>
@@ -5775,60 +4829,16 @@
           <w:szCs w:val="21"/>
           <w:lang w:val="es-PE"/>
         </w:rPr>
-        <w:t>Producción (</w:t>
-      </w:r>
-      <w:proofErr w:type="spellStart"/>
-      <w:r>
-        <w:rPr>
-          <w:rFonts w:ascii="Arial" w:hAnsi="Arial" w:cs="Arial"/>
-          <w:b/>
-          <w:bCs/>
-          <w:sz w:val="21"/>
-          <w:szCs w:val="21"/>
-          <w:lang w:val="es-PE"/>
-        </w:rPr>
-        <w:t>Prod</w:t>
-      </w:r>
-      <w:proofErr w:type="spellEnd"/>
-      <w:r>
-        <w:rPr>
-          <w:rFonts w:ascii="Arial" w:hAnsi="Arial" w:cs="Arial"/>
-          <w:b/>
-          <w:bCs/>
-          <w:sz w:val="21"/>
-          <w:szCs w:val="21"/>
-          <w:lang w:val="es-PE"/>
-        </w:rPr>
-        <w:t>):</w:t>
-      </w:r>
-      <w:r>
-        <w:rPr>
-          <w:rFonts w:ascii="Arial" w:hAnsi="Arial" w:cs="Arial"/>
-          <w:sz w:val="21"/>
-          <w:szCs w:val="21"/>
-          <w:lang w:val="es-PE"/>
-        </w:rPr>
-        <w:t> Entorno final disponible para el GRC, gestionado en una Subscripción dedicada de Producción (oris-</w:t>
-      </w:r>
-      <w:proofErr w:type="spellStart"/>
-      <w:r>
-        <w:rPr>
-          <w:rFonts w:ascii="Arial" w:hAnsi="Arial" w:cs="Arial"/>
-          <w:sz w:val="21"/>
-          <w:szCs w:val="21"/>
-          <w:lang w:val="es-PE"/>
-        </w:rPr>
-        <w:t>prod</w:t>
-      </w:r>
-      <w:proofErr w:type="spellEnd"/>
-      <w:r>
-        <w:rPr>
-          <w:rFonts w:ascii="Arial" w:hAnsi="Arial" w:cs="Arial"/>
-          <w:sz w:val="21"/>
-          <w:szCs w:val="21"/>
-          <w:lang w:val="es-PE"/>
-        </w:rPr>
-        <w:t>) sobre un AKS con 3+ Nodos (D4s_v5) balanceados tras un APIM.</w:t>
+        <w:t>Producción (Prod):</w:t>
+      </w:r>
+      <w:r>
+        <w:rPr>
+          <w:rFonts w:ascii="Arial" w:hAnsi="Arial" w:cs="Arial"/>
+          <w:sz w:val="21"/>
+          <w:szCs w:val="21"/>
+          <w:lang w:val="es-PE"/>
+        </w:rPr>
+        <w:t> Entorno final disponible para el GRC, gestionado en una Subscripción dedicada de Producción (oris-prod) sobre un AKS con 3+ Nodos (D4s_v5) balanceados tras un APIM.</w:t>
       </w:r>
     </w:p>
     <w:p>
@@ -5869,76 +4879,19 @@
           <w:szCs w:val="21"/>
           <w:lang w:val="es-PE"/>
         </w:rPr>
-        <w:t xml:space="preserve">Visual Studio Code, IntelliJ IDEA / STS para </w:t>
-      </w:r>
-      <w:proofErr w:type="spellStart"/>
-      <w:r>
-        <w:rPr>
-          <w:rFonts w:ascii="Arial" w:hAnsi="Arial" w:cs="Arial"/>
-          <w:sz w:val="21"/>
-          <w:szCs w:val="21"/>
-          <w:lang w:val="es-PE"/>
-        </w:rPr>
-        <w:t>Backend</w:t>
-      </w:r>
-      <w:proofErr w:type="spellEnd"/>
-      <w:r>
-        <w:rPr>
-          <w:rFonts w:ascii="Arial" w:hAnsi="Arial" w:cs="Arial"/>
-          <w:sz w:val="21"/>
-          <w:szCs w:val="21"/>
-          <w:lang w:val="es-PE"/>
-        </w:rPr>
-        <w:t>. Monitorización con </w:t>
-      </w:r>
-      <w:r>
-        <w:rPr>
-          <w:rFonts w:ascii="Arial" w:hAnsi="Arial" w:cs="Arial"/>
-          <w:b/>
-          <w:bCs/>
-          <w:sz w:val="21"/>
-          <w:szCs w:val="21"/>
-          <w:lang w:val="es-PE"/>
-        </w:rPr>
-        <w:t xml:space="preserve">Azure </w:t>
-      </w:r>
-      <w:proofErr w:type="spellStart"/>
-      <w:r>
-        <w:rPr>
-          <w:rFonts w:ascii="Arial" w:hAnsi="Arial" w:cs="Arial"/>
-          <w:b/>
-          <w:bCs/>
-          <w:sz w:val="21"/>
-          <w:szCs w:val="21"/>
-          <w:lang w:val="es-PE"/>
-        </w:rPr>
-        <w:t>Application</w:t>
-      </w:r>
-      <w:proofErr w:type="spellEnd"/>
-      <w:r>
-        <w:rPr>
-          <w:rFonts w:ascii="Arial" w:hAnsi="Arial" w:cs="Arial"/>
-          <w:b/>
-          <w:bCs/>
-          <w:sz w:val="21"/>
-          <w:szCs w:val="21"/>
-          <w:lang w:val="es-PE"/>
-        </w:rPr>
-        <w:t xml:space="preserve"> </w:t>
-      </w:r>
-      <w:proofErr w:type="spellStart"/>
-      <w:r>
-        <w:rPr>
-          <w:rFonts w:ascii="Arial" w:hAnsi="Arial" w:cs="Arial"/>
-          <w:b/>
-          <w:bCs/>
-          <w:sz w:val="21"/>
-          <w:szCs w:val="21"/>
-          <w:lang w:val="es-PE"/>
-        </w:rPr>
-        <w:t>Insights</w:t>
-      </w:r>
-      <w:proofErr w:type="spellEnd"/>
+        <w:t>Visual Studio Code, IntelliJ IDEA / STS para Backend. Monitorización con </w:t>
+      </w:r>
+      <w:r>
+        <w:rPr>
+          <w:rFonts w:ascii="Arial" w:hAnsi="Arial" w:cs="Arial"/>
+          <w:b/>
+          <w:bCs/>
+          <w:sz w:val="21"/>
+          <w:szCs w:val="21"/>
+          <w:lang w:val="es-PE"/>
+        </w:rPr>
+        <w:t>Azure Application Insights</w:t>
+      </w:r>
       <w:r>
         <w:rPr>
           <w:rFonts w:ascii="Arial" w:hAnsi="Arial" w:cs="Arial"/>
@@ -5957,45 +4910,8 @@
           <w:szCs w:val="21"/>
           <w:lang w:val="es-PE"/>
         </w:rPr>
-        <w:t xml:space="preserve">Log </w:t>
-      </w:r>
-      <w:proofErr w:type="spellStart"/>
-      <w:r>
-        <w:rPr>
-          <w:rFonts w:ascii="Arial" w:hAnsi="Arial" w:cs="Arial"/>
-          <w:b/>
-          <w:bCs/>
-          <w:sz w:val="21"/>
-          <w:szCs w:val="21"/>
-          <w:lang w:val="es-PE"/>
-        </w:rPr>
-        <w:t>Analytics</w:t>
-      </w:r>
-      <w:proofErr w:type="spellEnd"/>
-      <w:r>
-        <w:rPr>
-          <w:rFonts w:ascii="Arial" w:hAnsi="Arial" w:cs="Arial"/>
-          <w:b/>
-          <w:bCs/>
-          <w:sz w:val="21"/>
-          <w:szCs w:val="21"/>
-          <w:lang w:val="es-PE"/>
-        </w:rPr>
-        <w:t xml:space="preserve"> </w:t>
-      </w:r>
-      <w:proofErr w:type="spellStart"/>
-      <w:r>
-        <w:rPr>
-          <w:rFonts w:ascii="Arial" w:hAnsi="Arial" w:cs="Arial"/>
-          <w:b/>
-          <w:bCs/>
-          <w:sz w:val="21"/>
-          <w:szCs w:val="21"/>
-          <w:lang w:val="es-PE"/>
-        </w:rPr>
-        <w:t>Workspace</w:t>
-      </w:r>
-      <w:proofErr w:type="spellEnd"/>
+        <w:t>Log Analytics Workspace</w:t>
+      </w:r>
       <w:r>
         <w:rPr>
           <w:rFonts w:ascii="Arial" w:hAnsi="Arial" w:cs="Arial"/>
@@ -6293,47 +5209,7 @@
           <w:szCs w:val="21"/>
           <w:lang w:val="es-PE"/>
         </w:rPr>
-        <w:t xml:space="preserve"> Topología de red </w:t>
-      </w:r>
-      <w:proofErr w:type="gramStart"/>
-      <w:r>
-        <w:rPr>
-          <w:rFonts w:ascii="Arial" w:hAnsi="Arial" w:cs="Arial"/>
-          <w:sz w:val="21"/>
-          <w:szCs w:val="21"/>
-          <w:lang w:val="es-PE"/>
-        </w:rPr>
-        <w:t>Hub</w:t>
-      </w:r>
-      <w:proofErr w:type="gramEnd"/>
-      <w:r>
-        <w:rPr>
-          <w:rFonts w:ascii="Arial" w:hAnsi="Arial" w:cs="Arial"/>
-          <w:sz w:val="21"/>
-          <w:szCs w:val="21"/>
-          <w:lang w:val="es-PE"/>
-        </w:rPr>
-        <w:t xml:space="preserve"> and </w:t>
-      </w:r>
-      <w:proofErr w:type="spellStart"/>
-      <w:r>
-        <w:rPr>
-          <w:rFonts w:ascii="Arial" w:hAnsi="Arial" w:cs="Arial"/>
-          <w:sz w:val="21"/>
-          <w:szCs w:val="21"/>
-          <w:lang w:val="es-PE"/>
-        </w:rPr>
-        <w:t>Spoke</w:t>
-      </w:r>
-      <w:proofErr w:type="spellEnd"/>
-      <w:r>
-        <w:rPr>
-          <w:rFonts w:ascii="Arial" w:hAnsi="Arial" w:cs="Arial"/>
-          <w:sz w:val="21"/>
-          <w:szCs w:val="21"/>
-          <w:lang w:val="es-PE"/>
-        </w:rPr>
-        <w:t xml:space="preserve"> con redes virtuales separadas, usando </w:t>
+        <w:t> Topología de red Hub and Spoke con redes virtuales separadas, usando </w:t>
       </w:r>
       <w:r>
         <w:rPr>
@@ -6444,27 +5320,7 @@
           <w:szCs w:val="21"/>
           <w:lang w:val="es-PE"/>
         </w:rPr>
-        <w:t xml:space="preserve"> enlazado mediante Private </w:t>
-      </w:r>
-      <w:proofErr w:type="spellStart"/>
-      <w:r>
-        <w:rPr>
-          <w:rFonts w:ascii="Arial" w:hAnsi="Arial" w:cs="Arial"/>
-          <w:sz w:val="21"/>
-          <w:szCs w:val="21"/>
-          <w:lang w:val="es-PE"/>
-        </w:rPr>
-        <w:t>Endpoints</w:t>
-      </w:r>
-      <w:proofErr w:type="spellEnd"/>
-      <w:r>
-        <w:rPr>
-          <w:rFonts w:ascii="Arial" w:hAnsi="Arial" w:cs="Arial"/>
-          <w:sz w:val="21"/>
-          <w:szCs w:val="21"/>
-          <w:lang w:val="es-PE"/>
-        </w:rPr>
-        <w:t xml:space="preserve"> (</w:t>
+        <w:t> enlazado mediante Private Endpoints (</w:t>
       </w:r>
       <w:r>
         <w:rPr>
@@ -6518,27 +5374,7 @@
           <w:szCs w:val="21"/>
           <w:lang w:val="es-PE"/>
         </w:rPr>
-        <w:t xml:space="preserve"> Cifrado de datos en tránsito a través de APIM y controladores </w:t>
-      </w:r>
-      <w:proofErr w:type="spellStart"/>
-      <w:r>
-        <w:rPr>
-          <w:rFonts w:ascii="Arial" w:hAnsi="Arial" w:cs="Arial"/>
-          <w:sz w:val="21"/>
-          <w:szCs w:val="21"/>
-          <w:lang w:val="es-PE"/>
-        </w:rPr>
-        <w:t>Ingress</w:t>
-      </w:r>
-      <w:proofErr w:type="spellEnd"/>
-      <w:r>
-        <w:rPr>
-          <w:rFonts w:ascii="Arial" w:hAnsi="Arial" w:cs="Arial"/>
-          <w:sz w:val="21"/>
-          <w:szCs w:val="21"/>
-          <w:lang w:val="es-PE"/>
-        </w:rPr>
-        <w:t>.</w:t>
+        <w:t> Cifrado de datos en tránsito a través de APIM y controladores Ingress.</w:t>
       </w:r>
     </w:p>
     <w:p>
@@ -6575,7 +5411,6 @@
         </w:rPr>
         <w:t> Recolección de trazas y logs utilizando </w:t>
       </w:r>
-      <w:proofErr w:type="spellStart"/>
       <w:r>
         <w:rPr>
           <w:rStyle w:val="Fuerte"/>
@@ -6584,9 +5419,17 @@
           <w:szCs w:val="21"/>
           <w:lang w:val="es-PE"/>
         </w:rPr>
-        <w:t>OTel</w:t>
-      </w:r>
-      <w:proofErr w:type="spellEnd"/>
+        <w:t>OTel Java Agent</w:t>
+      </w:r>
+      <w:r>
+        <w:rPr>
+          <w:rFonts w:ascii="Arial" w:hAnsi="Arial" w:cs="Arial"/>
+          <w:sz w:val="21"/>
+          <w:szCs w:val="21"/>
+          <w:lang w:val="es-PE"/>
+        </w:rPr>
+        <w:t> y emitiendo hacia </w:t>
+      </w:r>
       <w:r>
         <w:rPr>
           <w:rStyle w:val="Fuerte"/>
@@ -6595,61 +5438,8 @@
           <w:szCs w:val="21"/>
           <w:lang w:val="es-PE"/>
         </w:rPr>
-        <w:t xml:space="preserve"> Java Agent</w:t>
-      </w:r>
-      <w:r>
-        <w:rPr>
-          <w:rFonts w:ascii="Arial" w:hAnsi="Arial" w:cs="Arial"/>
-          <w:sz w:val="21"/>
-          <w:szCs w:val="21"/>
-          <w:lang w:val="es-PE"/>
-        </w:rPr>
-        <w:t> y emitiendo hacia </w:t>
-      </w:r>
-      <w:r>
-        <w:rPr>
-          <w:rStyle w:val="Fuerte"/>
-          <w:rFonts w:ascii="Arial" w:hAnsi="Arial" w:cs="Arial"/>
-          <w:sz w:val="21"/>
-          <w:szCs w:val="21"/>
-          <w:lang w:val="es-PE"/>
-        </w:rPr>
-        <w:t xml:space="preserve">Azure </w:t>
-      </w:r>
-      <w:proofErr w:type="spellStart"/>
-      <w:r>
-        <w:rPr>
-          <w:rStyle w:val="Fuerte"/>
-          <w:rFonts w:ascii="Arial" w:hAnsi="Arial" w:cs="Arial"/>
-          <w:sz w:val="21"/>
-          <w:szCs w:val="21"/>
-          <w:lang w:val="es-PE"/>
-        </w:rPr>
-        <w:t>Application</w:t>
-      </w:r>
-      <w:proofErr w:type="spellEnd"/>
-      <w:r>
-        <w:rPr>
-          <w:rStyle w:val="Fuerte"/>
-          <w:rFonts w:ascii="Arial" w:hAnsi="Arial" w:cs="Arial"/>
-          <w:sz w:val="21"/>
-          <w:szCs w:val="21"/>
-          <w:lang w:val="es-PE"/>
-        </w:rPr>
-        <w:t xml:space="preserve"> </w:t>
-      </w:r>
-      <w:proofErr w:type="spellStart"/>
-      <w:r>
-        <w:rPr>
-          <w:rStyle w:val="Fuerte"/>
-          <w:rFonts w:ascii="Arial" w:hAnsi="Arial" w:cs="Arial"/>
-          <w:sz w:val="21"/>
-          <w:szCs w:val="21"/>
-          <w:lang w:val="es-PE"/>
-        </w:rPr>
-        <w:t>Insights</w:t>
-      </w:r>
-      <w:proofErr w:type="spellEnd"/>
+        <w:t>Azure Application Insights</w:t>
+      </w:r>
       <w:r>
         <w:rPr>
           <w:rFonts w:ascii="Arial" w:hAnsi="Arial" w:cs="Arial"/>
@@ -6800,7 +5590,7 @@
                     </pic:cNvPicPr>
                   </pic:nvPicPr>
                   <pic:blipFill rotWithShape="1">
-                    <a:blip r:embed="rId14" cstate="print">
+                    <a:blip r:embed="rId16" cstate="print">
                       <a:extLst>
                         <a:ext uri="{28A0092B-C50C-407E-A947-70E740481C1C}">
                           <a14:useLocalDpi xmlns:a14="http://schemas.microsoft.com/office/drawing/2010/main" val="0"/>
@@ -6942,47 +5732,7 @@
           <w:szCs w:val="21"/>
           <w:lang w:val="es-PE"/>
         </w:rPr>
-        <w:t xml:space="preserve">Despliegue de scripts DDL para esquemas, tablas, y vistas optimizadas para el </w:t>
-      </w:r>
-      <w:proofErr w:type="spellStart"/>
-      <w:r>
-        <w:rPr>
-          <w:rFonts w:ascii="Arial" w:hAnsi="Arial" w:cs="Arial"/>
-          <w:sz w:val="21"/>
-          <w:szCs w:val="21"/>
-          <w:lang w:val="es-PE"/>
-        </w:rPr>
-        <w:t>Dashboarding</w:t>
-      </w:r>
-      <w:proofErr w:type="spellEnd"/>
-      <w:r>
-        <w:rPr>
-          <w:rFonts w:ascii="Arial" w:hAnsi="Arial" w:cs="Arial"/>
-          <w:sz w:val="21"/>
-          <w:szCs w:val="21"/>
-          <w:lang w:val="es-PE"/>
-        </w:rPr>
-        <w:t xml:space="preserve">, con los correspondientes </w:t>
-      </w:r>
-      <w:proofErr w:type="spellStart"/>
-      <w:r>
-        <w:rPr>
-          <w:rFonts w:ascii="Arial" w:hAnsi="Arial" w:cs="Arial"/>
-          <w:sz w:val="21"/>
-          <w:szCs w:val="21"/>
-          <w:lang w:val="es-PE"/>
-        </w:rPr>
-        <w:t>Triggers</w:t>
-      </w:r>
-      <w:proofErr w:type="spellEnd"/>
-      <w:r>
-        <w:rPr>
-          <w:rFonts w:ascii="Arial" w:hAnsi="Arial" w:cs="Arial"/>
-          <w:sz w:val="21"/>
-          <w:szCs w:val="21"/>
-          <w:lang w:val="es-PE"/>
-        </w:rPr>
-        <w:t xml:space="preserve"> para históricos y reportes.</w:t>
+        <w:t>Despliegue de scripts DDL para esquemas, tablas, y vistas optimizadas para el Dashboarding, con los correspondientes Triggers para históricos y reportes.</w:t>
       </w:r>
     </w:p>
     <w:p>
@@ -7016,7 +5766,7 @@
                     </pic:cNvPicPr>
                   </pic:nvPicPr>
                   <pic:blipFill>
-                    <a:blip r:embed="rId15">
+                    <a:blip r:embed="rId17">
                       <a:extLst>
                         <a:ext uri="{28A0092B-C50C-407E-A947-70E740481C1C}">
                           <a14:useLocalDpi xmlns:a14="http://schemas.microsoft.com/office/drawing/2010/main" val="0"/>
@@ -7247,6 +5997,7 @@
       </w:pPr>
     </w:p>
     <w:sectPr>
+      <w:headerReference w:type="default" r:id="rId18"/>
       <w:footnotePr>
         <w:numRestart w:val="eachSect"/>
       </w:footnotePr>
@@ -8174,7 +6925,7 @@
         <w:noProof/>
       </w:rPr>
       <w:drawing>
-        <wp:anchor distT="0" distB="0" distL="114300" distR="114300" simplePos="0" relativeHeight="251660288" behindDoc="1" locked="0" layoutInCell="1" allowOverlap="1" wp14:anchorId="7ED60E9E" wp14:editId="540B0311">
+        <wp:anchor distT="0" distB="0" distL="114300" distR="114300" simplePos="0" relativeHeight="251660288" behindDoc="1" locked="0" layoutInCell="1" allowOverlap="1" wp14:anchorId="7ED60E9E" wp14:editId="5EAB8D05">
           <wp:simplePos x="0" y="0"/>
           <wp:positionH relativeFrom="column">
             <wp:posOffset>4781957</wp:posOffset>
@@ -8300,6 +7051,280 @@
 </w:hdr>
 </file>
 
+<file path=word/header2.xml><?xml version="1.0" encoding="utf-8"?>
+<w:hdr xmlns:wpc="http://schemas.microsoft.com/office/word/2010/wordprocessingCanvas" xmlns:cx="http://schemas.microsoft.com/office/drawing/2014/chartex" xmlns:cx1="http://schemas.microsoft.com/office/drawing/2015/9/8/chartex" xmlns:cx2="http://schemas.microsoft.com/office/drawing/2015/10/21/chartex" xmlns:cx3="http://schemas.microsoft.com/office/drawing/2016/5/9/chartex" xmlns:cx4="http://schemas.microsoft.com/office/drawing/2016/5/10/chartex" xmlns:cx5="http://schemas.microsoft.com/office/drawing/2016/5/11/chartex" xmlns:cx6="http://schemas.microsoft.com/office/drawing/2016/5/12/chartex" xmlns:cx7="http://schemas.microsoft.com/office/drawing/2016/5/13/chartex" xmlns:cx8="http://schemas.microsoft.com/office/drawing/2016/5/14/chartex" xmlns:mc="http://schemas.openxmlformats.org/markup-compatibility/2006" xmlns:aink="http://schemas.microsoft.com/office/drawing/2016/ink" xmlns:am3d="http://schemas.microsoft.com/office/drawing/2017/model3d" xmlns:o="urn:schemas-microsoft-com:office:office" xmlns:oel="http://schemas.microsoft.com/office/2019/extlst" xmlns:r="http://schemas.openxmlformats.org/officeDocument/2006/relationships" xmlns:m="http://schemas.openxmlformats.org/officeDocument/2006/math" xmlns:v="urn:schemas-microsoft-com:vml" xmlns:wp14="http://schemas.microsoft.com/office/word/2010/wordprocessingDrawing" xmlns:wp="http://schemas.openxmlformats.org/drawingml/2006/wordprocessingDrawing" xmlns:w10="urn:schemas-microsoft-com:office:word" xmlns:w="http://schemas.openxmlformats.org/wordprocessingml/2006/main" xmlns:w14="http://schemas.microsoft.com/office/word/2010/wordml" xmlns:w15="http://schemas.microsoft.com/office/word/2012/wordml" xmlns:w16cex="http://schemas.microsoft.com/office/word/2018/wordml/cex" xmlns:w16cid="http://schemas.microsoft.com/office/word/2016/wordml/cid" xmlns:w16="http://schemas.microsoft.com/office/word/2018/wordml" xmlns:w16du="http://schemas.microsoft.com/office/word/2023/wordml/word16du" xmlns:w16sdtdh="http://schemas.microsoft.com/office/word/2020/wordml/sdtdatahash" xmlns:w16sdtfl="http://schemas.microsoft.com/office/word/2024/wordml/sdtformatlock" xmlns:w16se="http://schemas.microsoft.com/office/word/2015/wordml/symex" xmlns:wpg="http://schemas.microsoft.com/office/word/2010/wordprocessingGroup" xmlns:wpi="http://schemas.microsoft.com/office/word/2010/wordprocessingInk" xmlns:wne="http://schemas.microsoft.com/office/word/2006/wordml" xmlns:wps="http://schemas.microsoft.com/office/word/2010/wordprocessingShape" mc:Ignorable="w14 w15 w16se w16cid w16 w16cex w16sdtdh w16sdtfl w16du wp14">
+  <w:p>
+    <w:pPr>
+      <w:pStyle w:val="Encabezado"/>
+    </w:pPr>
+    <w:r>
+      <w:rPr>
+        <w:noProof/>
+      </w:rPr>
+      <w:drawing>
+        <wp:anchor distT="0" distB="0" distL="114300" distR="114300" simplePos="0" relativeHeight="251668480" behindDoc="1" locked="0" layoutInCell="1" allowOverlap="1" wp14:anchorId="68F6776F" wp14:editId="054BCB91">
+          <wp:simplePos x="0" y="0"/>
+          <wp:positionH relativeFrom="column">
+            <wp:posOffset>6917026</wp:posOffset>
+          </wp:positionH>
+          <wp:positionV relativeFrom="paragraph">
+            <wp:posOffset>-1925645</wp:posOffset>
+          </wp:positionV>
+          <wp:extent cx="4160520" cy="3849370"/>
+          <wp:effectExtent l="0" t="0" r="0" b="0"/>
+          <wp:wrapNone/>
+          <wp:docPr id="1630626826" name="Picture 74" descr="1"/>
+          <wp:cNvGraphicFramePr>
+            <a:graphicFrameLocks xmlns:a="http://schemas.openxmlformats.org/drawingml/2006/main" noChangeAspect="1"/>
+          </wp:cNvGraphicFramePr>
+          <a:graphic xmlns:a="http://schemas.openxmlformats.org/drawingml/2006/main">
+            <a:graphicData uri="http://schemas.openxmlformats.org/drawingml/2006/picture">
+              <pic:pic xmlns:pic="http://schemas.openxmlformats.org/drawingml/2006/picture">
+                <pic:nvPicPr>
+                  <pic:cNvPr id="3" name="Picture 74" descr="1"/>
+                  <pic:cNvPicPr>
+                    <a:picLocks noChangeAspect="1" noChangeArrowheads="1"/>
+                  </pic:cNvPicPr>
+                </pic:nvPicPr>
+                <pic:blipFill>
+                  <a:blip r:embed="rId1">
+                    <a:extLst>
+                      <a:ext uri="{28A0092B-C50C-407E-A947-70E740481C1C}">
+                        <a14:useLocalDpi xmlns:a14="http://schemas.microsoft.com/office/drawing/2010/main" val="0"/>
+                      </a:ext>
+                    </a:extLst>
+                  </a:blip>
+                  <a:srcRect/>
+                  <a:stretch>
+                    <a:fillRect/>
+                  </a:stretch>
+                </pic:blipFill>
+                <pic:spPr bwMode="auto">
+                  <a:xfrm>
+                    <a:off x="0" y="0"/>
+                    <a:ext cx="4160520" cy="3849370"/>
+                  </a:xfrm>
+                  <a:prstGeom prst="rect">
+                    <a:avLst/>
+                  </a:prstGeom>
+                  <a:noFill/>
+                  <a:ln>
+                    <a:noFill/>
+                  </a:ln>
+                </pic:spPr>
+              </pic:pic>
+            </a:graphicData>
+          </a:graphic>
+          <wp14:sizeRelH relativeFrom="page">
+            <wp14:pctWidth>0</wp14:pctWidth>
+          </wp14:sizeRelH>
+          <wp14:sizeRelV relativeFrom="page">
+            <wp14:pctHeight>0</wp14:pctHeight>
+          </wp14:sizeRelV>
+        </wp:anchor>
+      </w:drawing>
+    </w:r>
+    <w:r>
+      <w:rPr>
+        <w:noProof/>
+      </w:rPr>
+      <w:drawing>
+        <wp:anchor distT="0" distB="0" distL="114300" distR="114300" simplePos="0" relativeHeight="251667456" behindDoc="0" locked="0" layoutInCell="1" allowOverlap="1" wp14:anchorId="7E3EF00A" wp14:editId="4F8B9A2E">
+          <wp:simplePos x="0" y="0"/>
+          <wp:positionH relativeFrom="margin">
+            <wp:posOffset>-680313</wp:posOffset>
+          </wp:positionH>
+          <wp:positionV relativeFrom="paragraph">
+            <wp:posOffset>-266192</wp:posOffset>
+          </wp:positionV>
+          <wp:extent cx="2086673" cy="490538"/>
+          <wp:effectExtent l="0" t="0" r="0" b="0"/>
+          <wp:wrapNone/>
+          <wp:docPr id="1813428211" name="Imagen 1813428211"/>
+          <wp:cNvGraphicFramePr>
+            <a:graphicFrameLocks xmlns:a="http://schemas.openxmlformats.org/drawingml/2006/main" noChangeAspect="1"/>
+          </wp:cNvGraphicFramePr>
+          <a:graphic xmlns:a="http://schemas.openxmlformats.org/drawingml/2006/main">
+            <a:graphicData uri="http://schemas.openxmlformats.org/drawingml/2006/picture">
+              <pic:pic xmlns:pic="http://schemas.openxmlformats.org/drawingml/2006/picture">
+                <pic:nvPicPr>
+                  <pic:cNvPr id="4" name="Imagen 4"/>
+                  <pic:cNvPicPr/>
+                </pic:nvPicPr>
+                <pic:blipFill>
+                  <a:blip r:embed="rId2" cstate="print">
+                    <a:extLst>
+                      <a:ext uri="{28A0092B-C50C-407E-A947-70E740481C1C}">
+                        <a14:useLocalDpi xmlns:a14="http://schemas.microsoft.com/office/drawing/2010/main" val="0"/>
+                      </a:ext>
+                    </a:extLst>
+                  </a:blip>
+                  <a:stretch>
+                    <a:fillRect/>
+                  </a:stretch>
+                </pic:blipFill>
+                <pic:spPr>
+                  <a:xfrm>
+                    <a:off x="0" y="0"/>
+                    <a:ext cx="2086673" cy="490538"/>
+                  </a:xfrm>
+                  <a:prstGeom prst="rect">
+                    <a:avLst/>
+                  </a:prstGeom>
+                </pic:spPr>
+              </pic:pic>
+            </a:graphicData>
+          </a:graphic>
+          <wp14:sizeRelH relativeFrom="page">
+            <wp14:pctWidth>0</wp14:pctWidth>
+          </wp14:sizeRelH>
+          <wp14:sizeRelV relativeFrom="page">
+            <wp14:pctHeight>0</wp14:pctHeight>
+          </wp14:sizeRelV>
+        </wp:anchor>
+      </w:drawing>
+    </w:r>
+  </w:p>
+</w:hdr>
+</file>
+
+<file path=word/header3.xml><?xml version="1.0" encoding="utf-8"?>
+<w:hdr xmlns:wpc="http://schemas.microsoft.com/office/word/2010/wordprocessingCanvas" xmlns:cx="http://schemas.microsoft.com/office/drawing/2014/chartex" xmlns:cx1="http://schemas.microsoft.com/office/drawing/2015/9/8/chartex" xmlns:cx2="http://schemas.microsoft.com/office/drawing/2015/10/21/chartex" xmlns:cx3="http://schemas.microsoft.com/office/drawing/2016/5/9/chartex" xmlns:cx4="http://schemas.microsoft.com/office/drawing/2016/5/10/chartex" xmlns:cx5="http://schemas.microsoft.com/office/drawing/2016/5/11/chartex" xmlns:cx6="http://schemas.microsoft.com/office/drawing/2016/5/12/chartex" xmlns:cx7="http://schemas.microsoft.com/office/drawing/2016/5/13/chartex" xmlns:cx8="http://schemas.microsoft.com/office/drawing/2016/5/14/chartex" xmlns:mc="http://schemas.openxmlformats.org/markup-compatibility/2006" xmlns:aink="http://schemas.microsoft.com/office/drawing/2016/ink" xmlns:am3d="http://schemas.microsoft.com/office/drawing/2017/model3d" xmlns:o="urn:schemas-microsoft-com:office:office" xmlns:oel="http://schemas.microsoft.com/office/2019/extlst" xmlns:r="http://schemas.openxmlformats.org/officeDocument/2006/relationships" xmlns:m="http://schemas.openxmlformats.org/officeDocument/2006/math" xmlns:v="urn:schemas-microsoft-com:vml" xmlns:wp14="http://schemas.microsoft.com/office/word/2010/wordprocessingDrawing" xmlns:wp="http://schemas.openxmlformats.org/drawingml/2006/wordprocessingDrawing" xmlns:w10="urn:schemas-microsoft-com:office:word" xmlns:w="http://schemas.openxmlformats.org/wordprocessingml/2006/main" xmlns:w14="http://schemas.microsoft.com/office/word/2010/wordml" xmlns:w15="http://schemas.microsoft.com/office/word/2012/wordml" xmlns:w16cex="http://schemas.microsoft.com/office/word/2018/wordml/cex" xmlns:w16cid="http://schemas.microsoft.com/office/word/2016/wordml/cid" xmlns:w16="http://schemas.microsoft.com/office/word/2018/wordml" xmlns:w16du="http://schemas.microsoft.com/office/word/2023/wordml/word16du" xmlns:w16sdtdh="http://schemas.microsoft.com/office/word/2020/wordml/sdtdatahash" xmlns:w16sdtfl="http://schemas.microsoft.com/office/word/2024/wordml/sdtformatlock" xmlns:w16se="http://schemas.microsoft.com/office/word/2015/wordml/symex" xmlns:wpg="http://schemas.microsoft.com/office/word/2010/wordprocessingGroup" xmlns:wpi="http://schemas.microsoft.com/office/word/2010/wordprocessingInk" xmlns:wne="http://schemas.microsoft.com/office/word/2006/wordml" xmlns:wps="http://schemas.microsoft.com/office/word/2010/wordprocessingShape" mc:Ignorable="w14 w15 w16se w16cid w16 w16cex w16sdtdh w16sdtfl w16du wp14">
+  <w:p>
+    <w:pPr>
+      <w:pStyle w:val="Encabezado"/>
+    </w:pPr>
+    <w:r>
+      <w:rPr>
+        <w:noProof/>
+      </w:rPr>
+      <w:drawing>
+        <wp:anchor distT="0" distB="0" distL="114300" distR="114300" simplePos="0" relativeHeight="251671552" behindDoc="1" locked="0" layoutInCell="1" allowOverlap="1" wp14:anchorId="7551E602" wp14:editId="15E0A07C">
+          <wp:simplePos x="0" y="0"/>
+          <wp:positionH relativeFrom="column">
+            <wp:posOffset>4673349</wp:posOffset>
+          </wp:positionH>
+          <wp:positionV relativeFrom="paragraph">
+            <wp:posOffset>-2201545</wp:posOffset>
+          </wp:positionV>
+          <wp:extent cx="4160520" cy="3849370"/>
+          <wp:effectExtent l="0" t="0" r="0" b="0"/>
+          <wp:wrapNone/>
+          <wp:docPr id="471479278" name="Picture 74" descr="1"/>
+          <wp:cNvGraphicFramePr>
+            <a:graphicFrameLocks xmlns:a="http://schemas.openxmlformats.org/drawingml/2006/main" noChangeAspect="1"/>
+          </wp:cNvGraphicFramePr>
+          <a:graphic xmlns:a="http://schemas.openxmlformats.org/drawingml/2006/main">
+            <a:graphicData uri="http://schemas.openxmlformats.org/drawingml/2006/picture">
+              <pic:pic xmlns:pic="http://schemas.openxmlformats.org/drawingml/2006/picture">
+                <pic:nvPicPr>
+                  <pic:cNvPr id="3" name="Picture 74" descr="1"/>
+                  <pic:cNvPicPr>
+                    <a:picLocks noChangeAspect="1" noChangeArrowheads="1"/>
+                  </pic:cNvPicPr>
+                </pic:nvPicPr>
+                <pic:blipFill>
+                  <a:blip r:embed="rId1">
+                    <a:extLst>
+                      <a:ext uri="{28A0092B-C50C-407E-A947-70E740481C1C}">
+                        <a14:useLocalDpi xmlns:a14="http://schemas.microsoft.com/office/drawing/2010/main" val="0"/>
+                      </a:ext>
+                    </a:extLst>
+                  </a:blip>
+                  <a:srcRect/>
+                  <a:stretch>
+                    <a:fillRect/>
+                  </a:stretch>
+                </pic:blipFill>
+                <pic:spPr bwMode="auto">
+                  <a:xfrm>
+                    <a:off x="0" y="0"/>
+                    <a:ext cx="4160520" cy="3849370"/>
+                  </a:xfrm>
+                  <a:prstGeom prst="rect">
+                    <a:avLst/>
+                  </a:prstGeom>
+                  <a:noFill/>
+                  <a:ln>
+                    <a:noFill/>
+                  </a:ln>
+                </pic:spPr>
+              </pic:pic>
+            </a:graphicData>
+          </a:graphic>
+          <wp14:sizeRelH relativeFrom="page">
+            <wp14:pctWidth>0</wp14:pctWidth>
+          </wp14:sizeRelH>
+          <wp14:sizeRelV relativeFrom="page">
+            <wp14:pctHeight>0</wp14:pctHeight>
+          </wp14:sizeRelV>
+        </wp:anchor>
+      </w:drawing>
+    </w:r>
+    <w:r>
+      <w:rPr>
+        <w:noProof/>
+      </w:rPr>
+      <w:drawing>
+        <wp:anchor distT="0" distB="0" distL="114300" distR="114300" simplePos="0" relativeHeight="251670528" behindDoc="0" locked="0" layoutInCell="1" allowOverlap="1" wp14:anchorId="1388CF51" wp14:editId="0286239B">
+          <wp:simplePos x="0" y="0"/>
+          <wp:positionH relativeFrom="margin">
+            <wp:posOffset>-680313</wp:posOffset>
+          </wp:positionH>
+          <wp:positionV relativeFrom="paragraph">
+            <wp:posOffset>-266192</wp:posOffset>
+          </wp:positionV>
+          <wp:extent cx="2086673" cy="490538"/>
+          <wp:effectExtent l="0" t="0" r="0" b="0"/>
+          <wp:wrapNone/>
+          <wp:docPr id="1629249693" name="Imagen 1629249693"/>
+          <wp:cNvGraphicFramePr>
+            <a:graphicFrameLocks xmlns:a="http://schemas.openxmlformats.org/drawingml/2006/main" noChangeAspect="1"/>
+          </wp:cNvGraphicFramePr>
+          <a:graphic xmlns:a="http://schemas.openxmlformats.org/drawingml/2006/main">
+            <a:graphicData uri="http://schemas.openxmlformats.org/drawingml/2006/picture">
+              <pic:pic xmlns:pic="http://schemas.openxmlformats.org/drawingml/2006/picture">
+                <pic:nvPicPr>
+                  <pic:cNvPr id="4" name="Imagen 4"/>
+                  <pic:cNvPicPr/>
+                </pic:nvPicPr>
+                <pic:blipFill>
+                  <a:blip r:embed="rId2" cstate="print">
+                    <a:extLst>
+                      <a:ext uri="{28A0092B-C50C-407E-A947-70E740481C1C}">
+                        <a14:useLocalDpi xmlns:a14="http://schemas.microsoft.com/office/drawing/2010/main" val="0"/>
+                      </a:ext>
+                    </a:extLst>
+                  </a:blip>
+                  <a:stretch>
+                    <a:fillRect/>
+                  </a:stretch>
+                </pic:blipFill>
+                <pic:spPr>
+                  <a:xfrm>
+                    <a:off x="0" y="0"/>
+                    <a:ext cx="2086673" cy="490538"/>
+                  </a:xfrm>
+                  <a:prstGeom prst="rect">
+                    <a:avLst/>
+                  </a:prstGeom>
+                </pic:spPr>
+              </pic:pic>
+            </a:graphicData>
+          </a:graphic>
+          <wp14:sizeRelH relativeFrom="page">
+            <wp14:pctWidth>0</wp14:pctWidth>
+          </wp14:sizeRelH>
+          <wp14:sizeRelV relativeFrom="page">
+            <wp14:pctHeight>0</wp14:pctHeight>
+          </wp14:sizeRelV>
+        </wp:anchor>
+      </w:drawing>
+    </w:r>
+  </w:p>
+</w:hdr>
+</file>
+
 <file path=word/numbering.xml><?xml version="1.0" encoding="utf-8"?>
 <w:numbering xmlns:wpc="http://schemas.microsoft.com/office/word/2010/wordprocessingCanvas" xmlns:cx="http://schemas.microsoft.com/office/drawing/2014/chartex" xmlns:cx1="http://schemas.microsoft.com/office/drawing/2015/9/8/chartex" xmlns:cx2="http://schemas.microsoft.com/office/drawing/2015/10/21/chartex" xmlns:cx3="http://schemas.microsoft.com/office/drawing/2016/5/9/chartex" xmlns:cx4="http://schemas.microsoft.com/office/drawing/2016/5/10/chartex" xmlns:cx5="http://schemas.microsoft.com/office/drawing/2016/5/11/chartex" xmlns:cx6="http://schemas.microsoft.com/office/drawing/2016/5/12/chartex" xmlns:cx7="http://schemas.microsoft.com/office/drawing/2016/5/13/chartex" xmlns:cx8="http://schemas.microsoft.com/office/drawing/2016/5/14/chartex" xmlns:mc="http://schemas.openxmlformats.org/markup-compatibility/2006" xmlns:aink="http://schemas.microsoft.com/office/drawing/2016/ink" xmlns:am3d="http://schemas.microsoft.com/office/drawing/2017/model3d" xmlns:o="urn:schemas-microsoft-com:office:office" xmlns:oel="http://schemas.microsoft.com/office/2019/extlst" xmlns:r="http://schemas.openxmlformats.org/officeDocument/2006/relationships" xmlns:m="http://schemas.openxmlformats.org/officeDocument/2006/math" xmlns:v="urn:schemas-microsoft-com:vml" xmlns:wp14="http://schemas.microsoft.com/office/word/2010/wordprocessingDrawing" xmlns:wp="http://schemas.openxmlformats.org/drawingml/2006/wordprocessingDrawing" xmlns:w10="urn:schemas-microsoft-com:office:word" xmlns:w="http://schemas.openxmlformats.org/wordprocessingml/2006/main" xmlns:w14="http://schemas.microsoft.com/office/word/2010/wordml" xmlns:w15="http://schemas.microsoft.com/office/word/2012/wordml" xmlns:w16cex="http://schemas.microsoft.com/office/word/2018/wordml/cex" xmlns:w16cid="http://schemas.microsoft.com/office/word/2016/wordml/cid" xmlns:w16="http://schemas.microsoft.com/office/word/2018/wordml" xmlns:w16du="http://schemas.microsoft.com/office/word/2023/wordml/word16du" xmlns:w16sdtdh="http://schemas.microsoft.com/office/word/2020/wordml/sdtdatahash" xmlns:w16sdtfl="http://schemas.microsoft.com/office/word/2024/wordml/sdtformatlock" xmlns:w16se="http://schemas.microsoft.com/office/word/2015/wordml/symex" xmlns:wpg="http://schemas.microsoft.com/office/word/2010/wordprocessingGroup" xmlns:wpi="http://schemas.microsoft.com/office/word/2010/wordprocessingInk" xmlns:wne="http://schemas.microsoft.com/office/word/2006/wordml" xmlns:wps="http://schemas.microsoft.com/office/word/2010/wordprocessingShape" mc:Ignorable="w14 w15 w16se w16cid w16 w16cex w16sdtdh w16sdtfl w16du wp14">
   <w:abstractNum w:abstractNumId="0" w15:restartNumberingAfterBreak="0">
@@ -10032,6 +9057,7 @@
     <w:lsdException w:name="footer" w:uiPriority="99"/>
     <w:lsdException w:name="Strong" w:uiPriority="22" w:qFormat="1"/>
     <w:lsdException w:name="Emphasis" w:uiPriority="20" w:qFormat="1"/>
+    <w:lsdException w:name="Normal (Web)" w:uiPriority="99"/>
     <w:lsdException w:name="HTML Code" w:uiPriority="99"/>
     <w:lsdException w:name="Normal Table" w:semiHidden="1" w:unhideWhenUsed="1"/>
     <w:lsdException w:name="Table Simple 1" w:semiHidden="1" w:unhideWhenUsed="1"/>
@@ -11381,10 +10407,20 @@
   <w:style w:type="paragraph" w:styleId="NormalWeb">
     <w:name w:val="Normal (Web)"/>
     <w:basedOn w:val="Normal"/>
+    <w:uiPriority w:val="99"/>
     <w:rsid w:val="00C16405"/>
     <w:rPr>
       <w:rFonts w:ascii="Times New Roman" w:hAnsi="Times New Roman" w:cs="Times New Roman"/>
     </w:rPr>
+  </w:style>
+  <w:style w:type="paragraph" w:styleId="Prrafodelista">
+    <w:name w:val="List Paragraph"/>
+    <w:basedOn w:val="Normal"/>
+    <w:rsid w:val="00CA3608"/>
+    <w:pPr>
+      <w:ind w:left="720"/>
+      <w:contextualSpacing/>
+    </w:pPr>
   </w:style>
 </w:styles>
 </file>

</xml_diff>